<commit_message>
feat(relazione): §4 separa capacità [l] e portata [l/min] in due colonne
La colonna unica cambiava unità di misura riga per riga: i recipienti vi
mettevano il volume, compressori, essiccatori e valvole la portata. Ogni
riga ne riempie ora una sola. Il lavoro era rimasto nel working tree senza
commit, e le relazioni generate in produzione mostravano ancora la colonna
fusa: un test d'integrazione legge la tabella dal documento renderizzato.

Co-Authored-By: Claude Opus 5 (1M context) <noreply@anthropic.com>
</commit_message>
<xml_diff>
--- a/public/templates/relazione-dm329.docx
+++ b/public/templates/relazione-dm329.docx
@@ -1,6 +1,6 @@
 
 <file path=word/document.xml><?xml version="1.0" encoding="utf-8"?>
-<w:document xmlns:wpc="http://schemas.microsoft.com/office/word/2010/wordprocessingCanvas" xmlns:cx="http://schemas.microsoft.com/office/drawing/2014/chartex" xmlns:cx1="http://schemas.microsoft.com/office/drawing/2015/9/8/chartex" xmlns:cx2="http://schemas.microsoft.com/office/drawing/2015/10/21/chartex" xmlns:cx3="http://schemas.microsoft.com/office/drawing/2016/5/9/chartex" xmlns:cx4="http://schemas.microsoft.com/office/drawing/2016/5/10/chartex" xmlns:cx5="http://schemas.microsoft.com/office/drawing/2016/5/11/chartex" xmlns:cx6="http://schemas.microsoft.com/office/drawing/2016/5/12/chartex" xmlns:cx7="http://schemas.microsoft.com/office/drawing/2016/5/13/chartex" xmlns:cx8="http://schemas.microsoft.com/office/drawing/2016/5/14/chartex" xmlns:mc="http://schemas.openxmlformats.org/markup-compatibility/2006" xmlns:aink="http://schemas.microsoft.com/office/drawing/2016/ink" xmlns:am3d="http://schemas.microsoft.com/office/drawing/2017/model3d" xmlns:o="urn:schemas-microsoft-com:office:office" xmlns:oel="http://schemas.microsoft.com/office/2019/extlst" xmlns:r="http://schemas.openxmlformats.org/officeDocument/2006/relationships" xmlns:m="http://schemas.openxmlformats.org/officeDocument/2006/math" xmlns:v="urn:schemas-microsoft-com:vml" xmlns:wp14="http://schemas.microsoft.com/office/word/2010/wordprocessingDrawing" xmlns:wp="http://schemas.openxmlformats.org/drawingml/2006/wordprocessingDrawing" xmlns:w10="urn:schemas-microsoft-com:office:word" xmlns:w="http://schemas.openxmlformats.org/wordprocessingml/2006/main" xmlns:w14="http://schemas.microsoft.com/office/word/2010/wordml" xmlns:w15="http://schemas.microsoft.com/office/word/2012/wordml" xmlns:w16cei="http://schemas.microsoft.com/office/word/2026/wordml/cei" xmlns:w16cex="http://schemas.microsoft.com/office/word/2018/wordml/cex" xmlns:w16cid="http://schemas.microsoft.com/office/word/2016/wordml/cid" xmlns:w16="http://schemas.microsoft.com/office/word/2018/wordml" xmlns:w16du="http://schemas.microsoft.com/office/word/2023/wordml/word16du" xmlns:w16sdtdh="http://schemas.microsoft.com/office/word/2020/wordml/sdtdatahash" xmlns:w16sdtfl="http://schemas.microsoft.com/office/word/2024/wordml/sdtformatlock" xmlns:w16se="http://schemas.microsoft.com/office/word/2015/wordml/symex" xmlns:wpg="http://schemas.microsoft.com/office/word/2010/wordprocessingGroup" xmlns:wpi="http://schemas.microsoft.com/office/word/2010/wordprocessingInk" xmlns:wne="http://schemas.microsoft.com/office/word/2006/wordml" xmlns:wps="http://schemas.microsoft.com/office/word/2010/wordprocessingShape" mc:Ignorable="w14 w15 w16se w16cid w16 w16cex w16sdtdh w16sdtfl w16du wp14">
+<w:document xmlns:wpc="http://schemas.microsoft.com/office/word/2010/wordprocessingCanvas" xmlns:cx="http://schemas.microsoft.com/office/drawing/2014/chartex" xmlns:cx1="http://schemas.microsoft.com/office/drawing/2015/9/8/chartex" xmlns:cx2="http://schemas.microsoft.com/office/drawing/2015/10/21/chartex" xmlns:cx3="http://schemas.microsoft.com/office/drawing/2016/5/9/chartex" xmlns:cx4="http://schemas.microsoft.com/office/drawing/2016/5/10/chartex" xmlns:cx5="http://schemas.microsoft.com/office/drawing/2016/5/11/chartex" xmlns:cx6="http://schemas.microsoft.com/office/drawing/2016/5/12/chartex" xmlns:cx7="http://schemas.microsoft.com/office/drawing/2016/5/13/chartex" xmlns:cx8="http://schemas.microsoft.com/office/drawing/2016/5/14/chartex" xmlns:mc="http://schemas.openxmlformats.org/markup-compatibility/2006" xmlns:aink="http://schemas.microsoft.com/office/drawing/2016/ink" xmlns:am3d="http://schemas.microsoft.com/office/drawing/2017/model3d" xmlns:o="urn:schemas-microsoft-com:office:office" xmlns:oel="http://schemas.microsoft.com/office/2019/extlst" xmlns:r="http://schemas.openxmlformats.org/officeDocument/2006/relationships" xmlns:m="http://schemas.openxmlformats.org/officeDocument/2006/math" xmlns:v="urn:schemas-microsoft-com:vml" xmlns:wp14="http://schemas.microsoft.com/office/word/2010/wordprocessingDrawing" xmlns:wp="http://schemas.openxmlformats.org/drawingml/2006/wordprocessingDrawing" xmlns:w10="urn:schemas-microsoft-com:office:word" xmlns:w="http://schemas.openxmlformats.org/wordprocessingml/2006/main" xmlns:w14="http://schemas.microsoft.com/office/word/2010/wordml" xmlns:w15="http://schemas.microsoft.com/office/word/2012/wordml" xmlns:w16cex="http://schemas.microsoft.com/office/word/2018/wordml/cex" xmlns:w16cid="http://schemas.microsoft.com/office/word/2016/wordml/cid" xmlns:w16="http://schemas.microsoft.com/office/word/2018/wordml" xmlns:w16du="http://schemas.microsoft.com/office/word/2023/wordml/word16du" xmlns:w16sdtdh="http://schemas.microsoft.com/office/word/2020/wordml/sdtdatahash" xmlns:w16sdtfl="http://schemas.microsoft.com/office/word/2024/wordml/sdtformatlock" xmlns:w16se="http://schemas.microsoft.com/office/word/2015/wordml/symex" xmlns:wpg="http://schemas.microsoft.com/office/word/2010/wordprocessingGroup" xmlns:wpi="http://schemas.microsoft.com/office/word/2010/wordprocessingInk" xmlns:wne="http://schemas.microsoft.com/office/word/2006/wordml" xmlns:wps="http://schemas.microsoft.com/office/word/2010/wordprocessingShape" mc:Ignorable="w14 w15 w16se w16cid w16 w16cex w16sdtdh w16sdtfl w16du wp14">
   <w:body>
     <w:p>
       <w:pPr>
@@ -517,27 +517,7 @@
           <w:sz w:val="22"/>
           <w:szCs w:val="22"/>
         </w:rPr>
-        <w:t xml:space="preserve">L’attuale revisione del documento è conseguente a: </w:t>
-      </w:r>
-      <w:r>
-        <w:rPr>
-          <w:rFonts w:ascii="Segoe UI" w:hAnsi="Segoe UI" w:cs="Segoe UI"/>
-          <w:b/>
-          <w:bCs/>
-          <w:sz w:val="22"/>
-          <w:szCs w:val="22"/>
-        </w:rPr>
-        <w:t>{premessa.motivoRevisione}</w:t>
-      </w:r>
-      <w:r>
-        <w:rPr>
-          <w:rFonts w:ascii="Segoe UI" w:hAnsi="Segoe UI" w:cs="Segoe UI"/>
-          <w:b/>
-          <w:bCs/>
-          <w:sz w:val="22"/>
-          <w:szCs w:val="22"/>
-        </w:rPr>
-        <w:t>. Vengono verificati i requisiti di sicurezza nelle nuove condizioni operative, con particolare riferimento alle valvole di sicurezza installate al momento della stesura di questa revisione.</w:t>
+        <w:t>L’attuale revisione del documento è conseguente a: {premessa.motivoRevisione}. Vengono verificati i requisiti di sicurezza nelle nuove condizioni operative, con particolare riferimento alle valvole di sicurezza installate al momento della stesura di questa revisione.</w:t>
       </w:r>
     </w:p>
     <w:p>
@@ -580,13 +560,17 @@
       <w:pPr>
         <w:rPr>
           <w:rFonts w:ascii="Segoe UI" w:hAnsi="Segoe UI" w:cs="Segoe UI"/>
-          <w:sz w:val="22"/>
-          <w:szCs w:val="22"/>
-        </w:rPr>
-      </w:pPr>
-      <w:r>
-        <w:rPr>
-          <w:rFonts w:ascii="Segoe UI" w:hAnsi="Segoe UI" w:cs="Segoe UI"/>
+          <w:i/>
+          <w:iCs/>
+          <w:sz w:val="22"/>
+          <w:szCs w:val="22"/>
+        </w:rPr>
+      </w:pPr>
+      <w:r>
+        <w:rPr>
+          <w:rFonts w:ascii="Segoe UI" w:hAnsi="Segoe UI" w:cs="Segoe UI"/>
+          <w:i/>
+          <w:iCs/>
           <w:sz w:val="22"/>
           <w:szCs w:val="22"/>
         </w:rPr>
@@ -595,6 +579,8 @@
       <w:r>
         <w:rPr>
           <w:rFonts w:ascii="Segoe UI" w:hAnsi="Segoe UI" w:cs="Segoe UI"/>
+          <w:i/>
+          <w:iCs/>
           <w:sz w:val="22"/>
           <w:szCs w:val="22"/>
         </w:rPr>
@@ -603,6 +589,8 @@
       <w:r>
         <w:rPr>
           <w:rFonts w:ascii="Segoe UI" w:hAnsi="Segoe UI" w:cs="Segoe UI"/>
+          <w:i/>
+          <w:iCs/>
           <w:sz w:val="22"/>
           <w:szCs w:val="22"/>
         </w:rPr>
@@ -753,7 +741,6 @@
         <w:pStyle w:val="Titolo2"/>
       </w:pPr>
       <w:r>
-        <w:lastRenderedPageBreak/>
         <w:t>2.2 Condizioni di installazione</w:t>
       </w:r>
     </w:p>
@@ -777,8 +764,8 @@
         <w:tblLook w:val="0000" w:firstRow="0" w:lastRow="0" w:firstColumn="0" w:lastColumn="0" w:noHBand="0" w:noVBand="0"/>
       </w:tblPr>
       <w:tblGrid>
-        <w:gridCol w:w="6763"/>
-        <w:gridCol w:w="2865"/>
+        <w:gridCol w:w="6451"/>
+        <w:gridCol w:w="3177"/>
       </w:tblGrid>
       <w:tr>
         <w:trPr>
@@ -1028,10 +1015,10 @@
         <w:tblLook w:val="0000" w:firstRow="0" w:lastRow="0" w:firstColumn="0" w:lastColumn="0" w:noHBand="0" w:noVBand="0"/>
       </w:tblPr>
       <w:tblGrid>
-        <w:gridCol w:w="2279"/>
-        <w:gridCol w:w="2149"/>
-        <w:gridCol w:w="1175"/>
-        <w:gridCol w:w="4025"/>
+        <w:gridCol w:w="2300"/>
+        <w:gridCol w:w="2142"/>
+        <w:gridCol w:w="1168"/>
+        <w:gridCol w:w="4018"/>
       </w:tblGrid>
       <w:tr>
         <w:trPr>
@@ -1435,15 +1422,16 @@
         <w:tblLook w:val="0000" w:firstRow="0" w:lastRow="0" w:firstColumn="0" w:lastColumn="0" w:noHBand="0" w:noVBand="0"/>
       </w:tblPr>
       <w:tblGrid>
-        <w:gridCol w:w="452"/>
-        <w:gridCol w:w="1386"/>
-        <w:gridCol w:w="2979"/>
-        <w:gridCol w:w="841"/>
-        <w:gridCol w:w="863"/>
-        <w:gridCol w:w="992"/>
-        <w:gridCol w:w="426"/>
-        <w:gridCol w:w="564"/>
-        <w:gridCol w:w="1125"/>
+        <w:gridCol w:w="1549"/>
+        <w:gridCol w:w="927"/>
+        <w:gridCol w:w="1365"/>
+        <w:gridCol w:w="717"/>
+        <w:gridCol w:w="717"/>
+        <w:gridCol w:w="815"/>
+        <w:gridCol w:w="1016"/>
+        <w:gridCol w:w="794"/>
+        <w:gridCol w:w="506"/>
+        <w:gridCol w:w="1939"/>
       </w:tblGrid>
       <w:tr>
         <w:trPr>
@@ -1463,6 +1451,7 @@
               <w:jc w:val="center"/>
               <w:rPr>
                 <w:rFonts w:ascii="Segoe UI" w:hAnsi="Segoe UI" w:cs="Segoe UI"/>
+                <w:spacing w:val="-10"/>
                 <w:sz w:val="18"/>
                 <w:szCs w:val="18"/>
               </w:rPr>
@@ -1471,6 +1460,7 @@
               <w:rPr>
                 <w:rFonts w:ascii="Segoe UI" w:hAnsi="Segoe UI" w:cs="Segoe UI"/>
                 <w:b/>
+                <w:spacing w:val="-10"/>
                 <w:sz w:val="18"/>
                 <w:szCs w:val="18"/>
               </w:rPr>
@@ -1490,6 +1480,7 @@
               <w:jc w:val="left"/>
               <w:rPr>
                 <w:rFonts w:ascii="Segoe UI" w:hAnsi="Segoe UI" w:cs="Segoe UI"/>
+                <w:spacing w:val="-10"/>
                 <w:sz w:val="18"/>
                 <w:szCs w:val="18"/>
               </w:rPr>
@@ -1498,6 +1489,7 @@
               <w:rPr>
                 <w:rFonts w:ascii="Segoe UI" w:hAnsi="Segoe UI" w:cs="Segoe UI"/>
                 <w:b/>
+                <w:spacing w:val="-10"/>
                 <w:sz w:val="18"/>
                 <w:szCs w:val="18"/>
               </w:rPr>
@@ -1507,7 +1499,7 @@
         </w:tc>
         <w:tc>
           <w:tcPr>
-            <w:tcW w:w="1547" w:type="pct"/>
+            <w:tcW w:w="1174" w:type="pct"/>
             <w:shd w:val="clear" w:color="auto" w:fill="E7E6E6"/>
             <w:vAlign w:val="center"/>
           </w:tcPr>
@@ -1517,6 +1509,7 @@
               <w:jc w:val="left"/>
               <w:rPr>
                 <w:rFonts w:ascii="Segoe UI" w:hAnsi="Segoe UI" w:cs="Segoe UI"/>
+                <w:spacing w:val="-10"/>
                 <w:sz w:val="18"/>
                 <w:szCs w:val="18"/>
               </w:rPr>
@@ -1525,6 +1518,7 @@
               <w:rPr>
                 <w:rFonts w:ascii="Segoe UI" w:hAnsi="Segoe UI" w:cs="Segoe UI"/>
                 <w:b/>
+                <w:spacing w:val="-10"/>
                 <w:sz w:val="18"/>
                 <w:szCs w:val="18"/>
               </w:rPr>
@@ -1534,7 +1528,7 @@
         </w:tc>
         <w:tc>
           <w:tcPr>
-            <w:tcW w:w="437" w:type="pct"/>
+            <w:tcW w:w="380" w:type="pct"/>
             <w:shd w:val="clear" w:color="auto" w:fill="E7E6E6"/>
             <w:vAlign w:val="center"/>
           </w:tcPr>
@@ -1545,6 +1539,7 @@
               <w:rPr>
                 <w:rFonts w:ascii="Segoe UI" w:hAnsi="Segoe UI" w:cs="Segoe UI"/>
                 <w:b/>
+                <w:spacing w:val="-10"/>
                 <w:sz w:val="18"/>
                 <w:szCs w:val="18"/>
               </w:rPr>
@@ -1553,6 +1548,7 @@
               <w:rPr>
                 <w:rFonts w:ascii="Segoe UI" w:hAnsi="Segoe UI" w:cs="Segoe UI"/>
                 <w:b/>
+                <w:spacing w:val="-10"/>
                 <w:sz w:val="18"/>
                 <w:szCs w:val="18"/>
               </w:rPr>
@@ -1562,12 +1558,20 @@
               <w:rPr>
                 <w:rFonts w:ascii="Segoe UI" w:hAnsi="Segoe UI" w:cs="Segoe UI"/>
                 <w:b/>
+                <w:spacing w:val="-10"/>
                 <w:sz w:val="18"/>
                 <w:szCs w:val="18"/>
               </w:rPr>
               <w:t xml:space="preserve"> [l]</w:t>
             </w:r>
           </w:p>
+        </w:tc>
+        <w:tc>
+          <w:tcPr>
+            <w:tcW w:w="430" w:type="pct"/>
+            <w:shd w:val="clear" w:color="auto" w:fill="E7E6E6"/>
+            <w:vAlign w:val="center"/>
+          </w:tcPr>
           <w:p>
             <w:pPr>
               <w:spacing w:after="0"/>
@@ -1575,6 +1579,7 @@
               <w:rPr>
                 <w:rFonts w:ascii="Segoe UI" w:hAnsi="Segoe UI" w:cs="Segoe UI"/>
                 <w:b/>
+                <w:spacing w:val="-10"/>
                 <w:sz w:val="18"/>
                 <w:szCs w:val="18"/>
               </w:rPr>
@@ -1583,18 +1588,27 @@
               <w:rPr>
                 <w:rFonts w:ascii="Segoe UI" w:hAnsi="Segoe UI" w:cs="Segoe UI"/>
                 <w:b/>
+                <w:spacing w:val="-10"/>
                 <w:sz w:val="18"/>
                 <w:szCs w:val="18"/>
               </w:rPr>
-              <w:t xml:space="preserve"> Portata</w:t>
-            </w:r>
-          </w:p>
-          <w:p>
-            <w:pPr>
-              <w:spacing w:after="0"/>
-              <w:jc w:val="center"/>
-              <w:rPr>
-                <w:rFonts w:ascii="Segoe UI" w:hAnsi="Segoe UI" w:cs="Segoe UI"/>
+              <w:t>Portata [l/min]</w:t>
+            </w:r>
+          </w:p>
+        </w:tc>
+        <w:tc>
+          <w:tcPr>
+            <w:tcW w:w="448" w:type="pct"/>
+            <w:shd w:val="clear" w:color="auto" w:fill="E7E6E6"/>
+            <w:vAlign w:val="center"/>
+          </w:tcPr>
+          <w:p>
+            <w:pPr>
+              <w:spacing w:after="0"/>
+              <w:jc w:val="center"/>
+              <w:rPr>
+                <w:rFonts w:ascii="Segoe UI" w:hAnsi="Segoe UI" w:cs="Segoe UI"/>
+                <w:spacing w:val="-10"/>
                 <w:sz w:val="18"/>
                 <w:szCs w:val="18"/>
               </w:rPr>
@@ -1603,16 +1617,17 @@
               <w:rPr>
                 <w:rFonts w:ascii="Segoe UI" w:hAnsi="Segoe UI" w:cs="Segoe UI"/>
                 <w:b/>
+                <w:spacing w:val="-10"/>
                 <w:sz w:val="18"/>
                 <w:szCs w:val="18"/>
               </w:rPr>
-              <w:t xml:space="preserve"> [l/min]</w:t>
-            </w:r>
-          </w:p>
-        </w:tc>
-        <w:tc>
-          <w:tcPr>
-            <w:tcW w:w="448" w:type="pct"/>
+              <w:t>Pressione [bar]</w:t>
+            </w:r>
+          </w:p>
+        </w:tc>
+        <w:tc>
+          <w:tcPr>
+            <w:tcW w:w="515" w:type="pct"/>
             <w:shd w:val="clear" w:color="auto" w:fill="E7E6E6"/>
             <w:vAlign w:val="center"/>
           </w:tcPr>
@@ -1622,6 +1637,8 @@
               <w:jc w:val="center"/>
               <w:rPr>
                 <w:rFonts w:ascii="Segoe UI" w:hAnsi="Segoe UI" w:cs="Segoe UI"/>
+                <w:b/>
+                <w:spacing w:val="-10"/>
                 <w:sz w:val="18"/>
                 <w:szCs w:val="18"/>
               </w:rPr>
@@ -1630,26 +1647,20 @@
               <w:rPr>
                 <w:rFonts w:ascii="Segoe UI" w:hAnsi="Segoe UI" w:cs="Segoe UI"/>
                 <w:b/>
+                <w:spacing w:val="-10"/>
                 <w:sz w:val="18"/>
                 <w:szCs w:val="18"/>
               </w:rPr>
-              <w:t>Pressione [bar]</w:t>
-            </w:r>
-          </w:p>
-        </w:tc>
-        <w:tc>
-          <w:tcPr>
-            <w:tcW w:w="515" w:type="pct"/>
-            <w:shd w:val="clear" w:color="auto" w:fill="E7E6E6"/>
-            <w:vAlign w:val="center"/>
-          </w:tcPr>
-          <w:p>
-            <w:pPr>
-              <w:spacing w:after="0"/>
-              <w:jc w:val="center"/>
-              <w:rPr>
-                <w:rFonts w:ascii="Segoe UI" w:hAnsi="Segoe UI" w:cs="Segoe UI"/>
-                <w:b/>
+              <w:t xml:space="preserve">Temp. </w:t>
+            </w:r>
+          </w:p>
+          <w:p>
+            <w:pPr>
+              <w:spacing w:after="0"/>
+              <w:jc w:val="center"/>
+              <w:rPr>
+                <w:rFonts w:ascii="Segoe UI" w:hAnsi="Segoe UI" w:cs="Segoe UI"/>
+                <w:spacing w:val="-10"/>
                 <w:sz w:val="18"/>
                 <w:szCs w:val="18"/>
               </w:rPr>
@@ -1658,18 +1669,27 @@
               <w:rPr>
                 <w:rFonts w:ascii="Segoe UI" w:hAnsi="Segoe UI" w:cs="Segoe UI"/>
                 <w:b/>
+                <w:spacing w:val="-10"/>
                 <w:sz w:val="18"/>
                 <w:szCs w:val="18"/>
               </w:rPr>
-              <w:t xml:space="preserve">Temp. </w:t>
-            </w:r>
-          </w:p>
-          <w:p>
-            <w:pPr>
-              <w:spacing w:after="0"/>
-              <w:jc w:val="center"/>
-              <w:rPr>
-                <w:rFonts w:ascii="Segoe UI" w:hAnsi="Segoe UI" w:cs="Segoe UI"/>
+              <w:t>[°C]</w:t>
+            </w:r>
+          </w:p>
+        </w:tc>
+        <w:tc>
+          <w:tcPr>
+            <w:tcW w:w="221" w:type="pct"/>
+            <w:shd w:val="clear" w:color="auto" w:fill="E7E6E6"/>
+            <w:vAlign w:val="center"/>
+          </w:tcPr>
+          <w:p>
+            <w:pPr>
+              <w:spacing w:after="0"/>
+              <w:jc w:val="center"/>
+              <w:rPr>
+                <w:rFonts w:ascii="Segoe UI" w:hAnsi="Segoe UI" w:cs="Segoe UI"/>
+                <w:spacing w:val="-10"/>
                 <w:sz w:val="18"/>
                 <w:szCs w:val="18"/>
               </w:rPr>
@@ -1678,16 +1698,17 @@
               <w:rPr>
                 <w:rFonts w:ascii="Segoe UI" w:hAnsi="Segoe UI" w:cs="Segoe UI"/>
                 <w:b/>
+                <w:spacing w:val="-10"/>
                 <w:sz w:val="18"/>
                 <w:szCs w:val="18"/>
               </w:rPr>
-              <w:t>[°C]</w:t>
-            </w:r>
-          </w:p>
-        </w:tc>
-        <w:tc>
-          <w:tcPr>
-            <w:tcW w:w="221" w:type="pct"/>
+              <w:t>Cat.</w:t>
+            </w:r>
+          </w:p>
+        </w:tc>
+        <w:tc>
+          <w:tcPr>
+            <w:tcW w:w="293" w:type="pct"/>
             <w:shd w:val="clear" w:color="auto" w:fill="E7E6E6"/>
             <w:vAlign w:val="center"/>
           </w:tcPr>
@@ -1697,6 +1718,7 @@
               <w:jc w:val="center"/>
               <w:rPr>
                 <w:rFonts w:ascii="Segoe UI" w:hAnsi="Segoe UI" w:cs="Segoe UI"/>
+                <w:spacing w:val="-10"/>
                 <w:sz w:val="18"/>
                 <w:szCs w:val="18"/>
               </w:rPr>
@@ -1705,25 +1727,27 @@
               <w:rPr>
                 <w:rFonts w:ascii="Segoe UI" w:hAnsi="Segoe UI" w:cs="Segoe UI"/>
                 <w:b/>
+                <w:spacing w:val="-10"/>
                 <w:sz w:val="18"/>
                 <w:szCs w:val="18"/>
               </w:rPr>
-              <w:t>Cat.</w:t>
-            </w:r>
-          </w:p>
-        </w:tc>
-        <w:tc>
-          <w:tcPr>
-            <w:tcW w:w="293" w:type="pct"/>
+              <w:t>Anno</w:t>
+            </w:r>
+          </w:p>
+        </w:tc>
+        <w:tc>
+          <w:tcPr>
+            <w:tcW w:w="585" w:type="pct"/>
             <w:shd w:val="clear" w:color="auto" w:fill="E7E6E6"/>
             <w:vAlign w:val="center"/>
           </w:tcPr>
           <w:p>
             <w:pPr>
               <w:spacing w:after="0"/>
-              <w:jc w:val="center"/>
-              <w:rPr>
-                <w:rFonts w:ascii="Segoe UI" w:hAnsi="Segoe UI" w:cs="Segoe UI"/>
+              <w:jc w:val="left"/>
+              <w:rPr>
+                <w:rFonts w:ascii="Segoe UI" w:hAnsi="Segoe UI" w:cs="Segoe UI"/>
+                <w:spacing w:val="-10"/>
                 <w:sz w:val="18"/>
                 <w:szCs w:val="18"/>
               </w:rPr>
@@ -1732,33 +1756,7 @@
               <w:rPr>
                 <w:rFonts w:ascii="Segoe UI" w:hAnsi="Segoe UI" w:cs="Segoe UI"/>
                 <w:b/>
-                <w:sz w:val="18"/>
-                <w:szCs w:val="18"/>
-              </w:rPr>
-              <w:t>Anno</w:t>
-            </w:r>
-          </w:p>
-        </w:tc>
-        <w:tc>
-          <w:tcPr>
-            <w:tcW w:w="585" w:type="pct"/>
-            <w:shd w:val="clear" w:color="auto" w:fill="E7E6E6"/>
-            <w:vAlign w:val="center"/>
-          </w:tcPr>
-          <w:p>
-            <w:pPr>
-              <w:spacing w:after="0"/>
-              <w:jc w:val="left"/>
-              <w:rPr>
-                <w:rFonts w:ascii="Segoe UI" w:hAnsi="Segoe UI" w:cs="Segoe UI"/>
-                <w:sz w:val="18"/>
-                <w:szCs w:val="18"/>
-              </w:rPr>
-            </w:pPr>
-            <w:r>
-              <w:rPr>
-                <w:rFonts w:ascii="Segoe UI" w:hAnsi="Segoe UI" w:cs="Segoe UI"/>
-                <w:b/>
+                <w:spacing w:val="-10"/>
                 <w:sz w:val="18"/>
                 <w:szCs w:val="18"/>
               </w:rPr>
@@ -1783,6 +1781,7 @@
               <w:jc w:val="center"/>
               <w:rPr>
                 <w:rFonts w:ascii="Segoe UI" w:hAnsi="Segoe UI" w:cs="Segoe UI"/>
+                <w:spacing w:val="-10"/>
                 <w:sz w:val="18"/>
                 <w:szCs w:val="18"/>
               </w:rPr>
@@ -1790,6 +1789,7 @@
             <w:r>
               <w:rPr>
                 <w:rFonts w:ascii="Segoe UI" w:hAnsi="Segoe UI" w:cs="Segoe UI"/>
+                <w:spacing w:val="-10"/>
                 <w:sz w:val="18"/>
                 <w:szCs w:val="18"/>
               </w:rPr>
@@ -1808,6 +1808,7 @@
               <w:jc w:val="left"/>
               <w:rPr>
                 <w:rFonts w:ascii="Segoe UI" w:hAnsi="Segoe UI" w:cs="Segoe UI"/>
+                <w:spacing w:val="-10"/>
                 <w:sz w:val="18"/>
                 <w:szCs w:val="18"/>
               </w:rPr>
@@ -1815,6 +1816,7 @@
             <w:r>
               <w:rPr>
                 <w:rFonts w:ascii="Segoe UI" w:hAnsi="Segoe UI" w:cs="Segoe UI"/>
+                <w:spacing w:val="-10"/>
                 <w:sz w:val="18"/>
                 <w:szCs w:val="18"/>
               </w:rPr>
@@ -1824,7 +1826,7 @@
         </w:tc>
         <w:tc>
           <w:tcPr>
-            <w:tcW w:w="1547" w:type="pct"/>
+            <w:tcW w:w="1174" w:type="pct"/>
             <w:vAlign w:val="center"/>
           </w:tcPr>
           <w:p>
@@ -1833,6 +1835,7 @@
               <w:jc w:val="left"/>
               <w:rPr>
                 <w:rFonts w:ascii="Segoe UI" w:hAnsi="Segoe UI" w:cs="Segoe UI"/>
+                <w:spacing w:val="-10"/>
                 <w:sz w:val="18"/>
                 <w:szCs w:val="18"/>
               </w:rPr>
@@ -1840,6 +1843,7 @@
             <w:r>
               <w:rPr>
                 <w:rFonts w:ascii="Segoe UI" w:hAnsi="Segoe UI" w:cs="Segoe UI"/>
+                <w:spacing w:val="-10"/>
                 <w:sz w:val="18"/>
                 <w:szCs w:val="18"/>
               </w:rPr>
@@ -1852,6 +1856,7 @@
               <w:jc w:val="left"/>
               <w:rPr>
                 <w:rFonts w:ascii="Segoe UI" w:hAnsi="Segoe UI" w:cs="Segoe UI"/>
+                <w:spacing w:val="-10"/>
                 <w:sz w:val="18"/>
                 <w:szCs w:val="18"/>
               </w:rPr>
@@ -1860,6 +1865,7 @@
               <w:rPr>
                 <w:rFonts w:ascii="Segoe UI" w:hAnsi="Segoe UI" w:cs="Segoe UI"/>
                 <w:i/>
+                <w:spacing w:val="-10"/>
                 <w:sz w:val="18"/>
                 <w:szCs w:val="18"/>
               </w:rPr>
@@ -1869,15 +1875,16 @@
         </w:tc>
         <w:tc>
           <w:tcPr>
-            <w:tcW w:w="437" w:type="pct"/>
-            <w:vAlign w:val="center"/>
-          </w:tcPr>
-          <w:p>
-            <w:pPr>
-              <w:spacing w:after="0"/>
-              <w:jc w:val="center"/>
-              <w:rPr>
-                <w:rFonts w:ascii="Segoe UI" w:hAnsi="Segoe UI" w:cs="Segoe UI"/>
+            <w:tcW w:w="380" w:type="pct"/>
+            <w:vAlign w:val="center"/>
+          </w:tcPr>
+          <w:p>
+            <w:pPr>
+              <w:spacing w:after="0"/>
+              <w:jc w:val="center"/>
+              <w:rPr>
+                <w:rFonts w:ascii="Segoe UI" w:hAnsi="Segoe UI" w:cs="Segoe UI"/>
+                <w:spacing w:val="-10"/>
                 <w:sz w:val="18"/>
                 <w:szCs w:val="18"/>
               </w:rPr>
@@ -1885,6 +1892,7 @@
             <w:r>
               <w:rPr>
                 <w:rFonts w:ascii="Segoe UI" w:hAnsi="Segoe UI" w:cs="Segoe UI"/>
+                <w:spacing w:val="-10"/>
                 <w:sz w:val="18"/>
                 <w:szCs w:val="18"/>
               </w:rPr>
@@ -1894,15 +1902,16 @@
         </w:tc>
         <w:tc>
           <w:tcPr>
-            <w:tcW w:w="448" w:type="pct"/>
-            <w:vAlign w:val="center"/>
-          </w:tcPr>
-          <w:p>
-            <w:pPr>
-              <w:spacing w:after="0"/>
-              <w:jc w:val="center"/>
-              <w:rPr>
-                <w:rFonts w:ascii="Segoe UI" w:hAnsi="Segoe UI" w:cs="Segoe UI"/>
+            <w:tcW w:w="430" w:type="pct"/>
+            <w:vAlign w:val="center"/>
+          </w:tcPr>
+          <w:p>
+            <w:pPr>
+              <w:spacing w:after="0"/>
+              <w:jc w:val="center"/>
+              <w:rPr>
+                <w:rFonts w:ascii="Segoe UI" w:hAnsi="Segoe UI" w:cs="Segoe UI"/>
+                <w:spacing w:val="-10"/>
                 <w:sz w:val="18"/>
                 <w:szCs w:val="18"/>
               </w:rPr>
@@ -1910,24 +1919,26 @@
             <w:r>
               <w:rPr>
                 <w:rFonts w:ascii="Segoe UI" w:hAnsi="Segoe UI" w:cs="Segoe UI"/>
+                <w:spacing w:val="-10"/>
                 <w:sz w:val="18"/>
                 <w:szCs w:val="18"/>
               </w:rPr>
-              <w:t>{pressione}</w:t>
-            </w:r>
-          </w:p>
-        </w:tc>
-        <w:tc>
-          <w:tcPr>
-            <w:tcW w:w="515" w:type="pct"/>
-            <w:vAlign w:val="center"/>
-          </w:tcPr>
-          <w:p>
-            <w:pPr>
-              <w:spacing w:after="0"/>
-              <w:jc w:val="center"/>
-              <w:rPr>
-                <w:rFonts w:ascii="Segoe UI" w:hAnsi="Segoe UI" w:cs="Segoe UI"/>
+              <w:t>{portata}</w:t>
+            </w:r>
+          </w:p>
+        </w:tc>
+        <w:tc>
+          <w:tcPr>
+            <w:tcW w:w="448" w:type="pct"/>
+            <w:vAlign w:val="center"/>
+          </w:tcPr>
+          <w:p>
+            <w:pPr>
+              <w:spacing w:after="0"/>
+              <w:jc w:val="center"/>
+              <w:rPr>
+                <w:rFonts w:ascii="Segoe UI" w:hAnsi="Segoe UI" w:cs="Segoe UI"/>
+                <w:spacing w:val="-10"/>
                 <w:sz w:val="18"/>
                 <w:szCs w:val="18"/>
               </w:rPr>
@@ -1935,24 +1946,26 @@
             <w:r>
               <w:rPr>
                 <w:rFonts w:ascii="Segoe UI" w:hAnsi="Segoe UI" w:cs="Segoe UI"/>
+                <w:spacing w:val="-10"/>
                 <w:sz w:val="18"/>
                 <w:szCs w:val="18"/>
               </w:rPr>
-              <w:t>{temperatura}</w:t>
-            </w:r>
-          </w:p>
-        </w:tc>
-        <w:tc>
-          <w:tcPr>
-            <w:tcW w:w="221" w:type="pct"/>
-            <w:vAlign w:val="center"/>
-          </w:tcPr>
-          <w:p>
-            <w:pPr>
-              <w:spacing w:after="0"/>
-              <w:jc w:val="center"/>
-              <w:rPr>
-                <w:rFonts w:ascii="Segoe UI" w:hAnsi="Segoe UI" w:cs="Segoe UI"/>
+              <w:t>{pressione}</w:t>
+            </w:r>
+          </w:p>
+        </w:tc>
+        <w:tc>
+          <w:tcPr>
+            <w:tcW w:w="515" w:type="pct"/>
+            <w:vAlign w:val="center"/>
+          </w:tcPr>
+          <w:p>
+            <w:pPr>
+              <w:spacing w:after="0"/>
+              <w:jc w:val="center"/>
+              <w:rPr>
+                <w:rFonts w:ascii="Segoe UI" w:hAnsi="Segoe UI" w:cs="Segoe UI"/>
+                <w:spacing w:val="-10"/>
                 <w:sz w:val="18"/>
                 <w:szCs w:val="18"/>
               </w:rPr>
@@ -1960,24 +1973,26 @@
             <w:r>
               <w:rPr>
                 <w:rFonts w:ascii="Segoe UI" w:hAnsi="Segoe UI" w:cs="Segoe UI"/>
+                <w:spacing w:val="-10"/>
                 <w:sz w:val="18"/>
                 <w:szCs w:val="18"/>
               </w:rPr>
-              <w:t>{categoria}</w:t>
-            </w:r>
-          </w:p>
-        </w:tc>
-        <w:tc>
-          <w:tcPr>
-            <w:tcW w:w="293" w:type="pct"/>
-            <w:vAlign w:val="center"/>
-          </w:tcPr>
-          <w:p>
-            <w:pPr>
-              <w:spacing w:after="0"/>
-              <w:jc w:val="center"/>
-              <w:rPr>
-                <w:rFonts w:ascii="Segoe UI" w:hAnsi="Segoe UI" w:cs="Segoe UI"/>
+              <w:t>{temperatura}</w:t>
+            </w:r>
+          </w:p>
+        </w:tc>
+        <w:tc>
+          <w:tcPr>
+            <w:tcW w:w="221" w:type="pct"/>
+            <w:vAlign w:val="center"/>
+          </w:tcPr>
+          <w:p>
+            <w:pPr>
+              <w:spacing w:after="0"/>
+              <w:jc w:val="center"/>
+              <w:rPr>
+                <w:rFonts w:ascii="Segoe UI" w:hAnsi="Segoe UI" w:cs="Segoe UI"/>
+                <w:spacing w:val="-10"/>
                 <w:sz w:val="18"/>
                 <w:szCs w:val="18"/>
               </w:rPr>
@@ -1985,24 +2000,26 @@
             <w:r>
               <w:rPr>
                 <w:rFonts w:ascii="Segoe UI" w:hAnsi="Segoe UI" w:cs="Segoe UI"/>
+                <w:spacing w:val="-10"/>
                 <w:sz w:val="18"/>
                 <w:szCs w:val="18"/>
               </w:rPr>
-              <w:t>{anno}</w:t>
-            </w:r>
-          </w:p>
-        </w:tc>
-        <w:tc>
-          <w:tcPr>
-            <w:tcW w:w="585" w:type="pct"/>
-            <w:vAlign w:val="center"/>
-          </w:tcPr>
-          <w:p>
-            <w:pPr>
-              <w:spacing w:after="0"/>
-              <w:jc w:val="left"/>
-              <w:rPr>
-                <w:rFonts w:ascii="Segoe UI" w:hAnsi="Segoe UI" w:cs="Segoe UI"/>
+              <w:t>{categoria}</w:t>
+            </w:r>
+          </w:p>
+        </w:tc>
+        <w:tc>
+          <w:tcPr>
+            <w:tcW w:w="293" w:type="pct"/>
+            <w:vAlign w:val="center"/>
+          </w:tcPr>
+          <w:p>
+            <w:pPr>
+              <w:spacing w:after="0"/>
+              <w:jc w:val="center"/>
+              <w:rPr>
+                <w:rFonts w:ascii="Segoe UI" w:hAnsi="Segoe UI" w:cs="Segoe UI"/>
+                <w:spacing w:val="-10"/>
                 <w:sz w:val="18"/>
                 <w:szCs w:val="18"/>
               </w:rPr>
@@ -2010,6 +2027,34 @@
             <w:r>
               <w:rPr>
                 <w:rFonts w:ascii="Segoe UI" w:hAnsi="Segoe UI" w:cs="Segoe UI"/>
+                <w:spacing w:val="-10"/>
+                <w:sz w:val="18"/>
+                <w:szCs w:val="18"/>
+              </w:rPr>
+              <w:t>{anno}</w:t>
+            </w:r>
+          </w:p>
+        </w:tc>
+        <w:tc>
+          <w:tcPr>
+            <w:tcW w:w="585" w:type="pct"/>
+            <w:vAlign w:val="center"/>
+          </w:tcPr>
+          <w:p>
+            <w:pPr>
+              <w:spacing w:after="0"/>
+              <w:jc w:val="left"/>
+              <w:rPr>
+                <w:rFonts w:ascii="Segoe UI" w:hAnsi="Segoe UI" w:cs="Segoe UI"/>
+                <w:spacing w:val="-10"/>
+                <w:sz w:val="18"/>
+                <w:szCs w:val="18"/>
+              </w:rPr>
+            </w:pPr>
+            <w:r>
+              <w:rPr>
+                <w:rFonts w:ascii="Segoe UI" w:hAnsi="Segoe UI" w:cs="Segoe UI"/>
+                <w:spacing w:val="-10"/>
                 <w:sz w:val="18"/>
                 <w:szCs w:val="18"/>
               </w:rPr>
@@ -2280,6 +2325,7 @@
                 <w:sz w:val="22"/>
                 <w:szCs w:val="22"/>
               </w:rPr>
+              <w:lastRenderedPageBreak/>
               <w:t>25 &lt; V ≤ 50 l</w:t>
             </w:r>
           </w:p>
@@ -2650,7 +2696,6 @@
                 <w:sz w:val="22"/>
                 <w:szCs w:val="22"/>
               </w:rPr>
-              <w:lastRenderedPageBreak/>
               <w:t>Tubazioni con DN ≤ 80 mm</w:t>
             </w:r>
           </w:p>
@@ -2759,16 +2804,16 @@
         <w:tblLook w:val="0000" w:firstRow="0" w:lastRow="0" w:firstColumn="0" w:lastColumn="0" w:noHBand="0" w:noVBand="0"/>
       </w:tblPr>
       <w:tblGrid>
-        <w:gridCol w:w="402"/>
-        <w:gridCol w:w="1101"/>
-        <w:gridCol w:w="2320"/>
-        <w:gridCol w:w="426"/>
-        <w:gridCol w:w="566"/>
-        <w:gridCol w:w="566"/>
-        <w:gridCol w:w="568"/>
-        <w:gridCol w:w="1417"/>
-        <w:gridCol w:w="1419"/>
-        <w:gridCol w:w="843"/>
+        <w:gridCol w:w="882"/>
+        <w:gridCol w:w="1283"/>
+        <w:gridCol w:w="929"/>
+        <w:gridCol w:w="673"/>
+        <w:gridCol w:w="424"/>
+        <w:gridCol w:w="642"/>
+        <w:gridCol w:w="809"/>
+        <w:gridCol w:w="1142"/>
+        <w:gridCol w:w="796"/>
+        <w:gridCol w:w="2048"/>
       </w:tblGrid>
       <w:tr>
         <w:trPr>
@@ -3455,12 +3500,12 @@
         <w:tblLook w:val="0000" w:firstRow="0" w:lastRow="0" w:firstColumn="0" w:lastColumn="0" w:noHBand="0" w:noVBand="0"/>
       </w:tblPr>
       <w:tblGrid>
-        <w:gridCol w:w="597"/>
-        <w:gridCol w:w="2516"/>
-        <w:gridCol w:w="1558"/>
-        <w:gridCol w:w="1381"/>
-        <w:gridCol w:w="1375"/>
-        <w:gridCol w:w="2201"/>
+        <w:gridCol w:w="2096"/>
+        <w:gridCol w:w="981"/>
+        <w:gridCol w:w="1497"/>
+        <w:gridCol w:w="1303"/>
+        <w:gridCol w:w="1095"/>
+        <w:gridCol w:w="2656"/>
       </w:tblGrid>
       <w:tr>
         <w:trPr>
@@ -3491,6 +3536,7 @@
                 <w:sz w:val="22"/>
                 <w:szCs w:val="22"/>
               </w:rPr>
+              <w:lastRenderedPageBreak/>
               <w:t>Pos.</w:t>
             </w:r>
           </w:p>
@@ -3680,15 +3726,13 @@
                 <w:rFonts w:ascii="Segoe UI" w:hAnsi="Segoe UI" w:cs="Segoe UI"/>
                 <w:sz w:val="22"/>
                 <w:szCs w:val="22"/>
-                <w:lang w:val="en-GB"/>
-              </w:rPr>
-            </w:pPr>
-            <w:r>
-              <w:rPr>
-                <w:rFonts w:ascii="Segoe UI" w:hAnsi="Segoe UI" w:cs="Segoe UI"/>
-                <w:sz w:val="22"/>
-                <w:szCs w:val="22"/>
-                <w:lang w:val="en-GB"/>
+              </w:rPr>
+            </w:pPr>
+            <w:r>
+              <w:rPr>
+                <w:rFonts w:ascii="Segoe UI" w:hAnsi="Segoe UI" w:cs="Segoe UI"/>
+                <w:sz w:val="22"/>
+                <w:szCs w:val="22"/>
               </w:rPr>
               <w:t>{#valvole}</w:t>
             </w:r>
@@ -3700,15 +3744,13 @@
                 <w:rFonts w:ascii="Segoe UI" w:hAnsi="Segoe UI" w:cs="Segoe UI"/>
                 <w:sz w:val="22"/>
                 <w:szCs w:val="22"/>
-                <w:lang w:val="en-GB"/>
-              </w:rPr>
-            </w:pPr>
-            <w:r>
-              <w:rPr>
-                <w:rFonts w:ascii="Segoe UI" w:hAnsi="Segoe UI" w:cs="Segoe UI"/>
-                <w:sz w:val="22"/>
-                <w:szCs w:val="22"/>
-                <w:lang w:val="en-GB"/>
+              </w:rPr>
+            </w:pPr>
+            <w:r>
+              <w:rPr>
+                <w:rFonts w:ascii="Segoe UI" w:hAnsi="Segoe UI" w:cs="Segoe UI"/>
+                <w:sz w:val="22"/>
+                <w:szCs w:val="22"/>
               </w:rPr>
               <w:t>{pos} – n.f. {nFabbrica}</w:t>
             </w:r>
@@ -3889,9 +3931,9 @@
         <w:tblLook w:val="0000" w:firstRow="0" w:lastRow="0" w:firstColumn="0" w:lastColumn="0" w:noHBand="0" w:noVBand="0"/>
       </w:tblPr>
       <w:tblGrid>
-        <w:gridCol w:w="1013"/>
-        <w:gridCol w:w="5573"/>
-        <w:gridCol w:w="3042"/>
+        <w:gridCol w:w="2370"/>
+        <w:gridCol w:w="4144"/>
+        <w:gridCol w:w="3114"/>
       </w:tblGrid>
       <w:tr>
         <w:trPr>
@@ -4118,130 +4160,122 @@
           <w:sz w:val="22"/>
           <w:szCs w:val="22"/>
         </w:rPr>
-        <w:t xml:space="preserve">Nei compressori la regolazione della pressione di esercizio è gestita mediante sonde di pressione e dalle valvole di sicurezza installate internamente per i casi di eventuale sovrappressione. I </w:t>
-      </w:r>
-      <w:r>
-        <w:rPr>
-          <w:rFonts w:ascii="Segoe UI" w:hAnsi="Segoe UI" w:cs="Segoe UI"/>
-          <w:sz w:val="22"/>
-          <w:szCs w:val="22"/>
-        </w:rPr>
+        <w:t>Nei compressori la regolazione della pressione di esercizio è gestita mediante sonde di pressione e dalle valvole di sicurezza installate internamente per i casi di eventuale sovrappressione. I compressori sono esclusi dal campo di applicazione del D.M. 329/2004 in base a quanto previsto dall’art. 1, comma 3, lettera L del D.lgs. 93/2000.</w:t>
+      </w:r>
+    </w:p>
+    <w:p>
+      <w:pPr>
+        <w:spacing w:after="0"/>
+        <w:rPr>
+          <w:rFonts w:ascii="Segoe UI" w:hAnsi="Segoe UI" w:cs="Segoe UI"/>
+          <w:sz w:val="22"/>
+          <w:szCs w:val="22"/>
+        </w:rPr>
+      </w:pPr>
+      <w:r>
+        <w:rPr>
+          <w:rFonts w:ascii="Segoe UI" w:hAnsi="Segoe UI" w:cs="Segoe UI"/>
+          <w:sz w:val="22"/>
+          <w:szCs w:val="22"/>
+        </w:rPr>
+        <w:t>{#tubazioni.escluse}</w:t>
+      </w:r>
+    </w:p>
+    <w:p>
+      <w:pPr>
+        <w:rPr>
+          <w:rFonts w:ascii="Segoe UI" w:hAnsi="Segoe UI" w:cs="Segoe UI"/>
+          <w:sz w:val="22"/>
+          <w:szCs w:val="22"/>
+        </w:rPr>
+      </w:pPr>
+      <w:r>
+        <w:rPr>
+          <w:rFonts w:ascii="Segoe UI" w:hAnsi="Segoe UI" w:cs="Segoe UI"/>
+          <w:sz w:val="22"/>
+          <w:szCs w:val="22"/>
+        </w:rPr>
+        <w:t>Tutte le tubazioni destinate a contenere aria compressa hanno DN ≤ 80 mm e sono pertanto escluse dal campo di applicazione del D.M. 329/2004 ai sensi dell’art. 3 comma bb) del medesimo decreto.</w:t>
+      </w:r>
+    </w:p>
+    <w:p>
+      <w:pPr>
+        <w:spacing w:after="0"/>
+        <w:rPr>
+          <w:rFonts w:ascii="Segoe UI" w:hAnsi="Segoe UI" w:cs="Segoe UI"/>
+          <w:sz w:val="22"/>
+          <w:szCs w:val="22"/>
+        </w:rPr>
+      </w:pPr>
+      <w:r>
+        <w:rPr>
+          <w:rFonts w:ascii="Segoe UI" w:hAnsi="Segoe UI" w:cs="Segoe UI"/>
+          <w:sz w:val="22"/>
+          <w:szCs w:val="22"/>
+        </w:rPr>
+        <w:t>{/tubazioni.escluse}</w:t>
+      </w:r>
+    </w:p>
+    <w:p>
+      <w:pPr>
+        <w:spacing w:after="0"/>
+        <w:rPr>
+          <w:rFonts w:ascii="Segoe UI" w:hAnsi="Segoe UI" w:cs="Segoe UI"/>
+          <w:sz w:val="22"/>
+          <w:szCs w:val="22"/>
+        </w:rPr>
+      </w:pPr>
+      <w:r>
+        <w:rPr>
+          <w:rFonts w:ascii="Segoe UI" w:hAnsi="Segoe UI" w:cs="Segoe UI"/>
+          <w:sz w:val="22"/>
+          <w:szCs w:val="22"/>
+        </w:rPr>
+        <w:t>{^tubazioni.escluse}</w:t>
+      </w:r>
+    </w:p>
+    <w:p>
+      <w:pPr>
+        <w:rPr>
+          <w:rFonts w:ascii="Segoe UI" w:hAnsi="Segoe UI" w:cs="Segoe UI"/>
+          <w:sz w:val="22"/>
+          <w:szCs w:val="22"/>
+        </w:rPr>
+      </w:pPr>
+      <w:r>
+        <w:rPr>
+          <w:rFonts w:ascii="Segoe UI" w:hAnsi="Segoe UI" w:cs="Segoe UI"/>
+          <w:sz w:val="22"/>
+          <w:szCs w:val="22"/>
+          <w:highlight w:val="yellow"/>
+        </w:rPr>
+        <w:t>Le tubazioni dell’impianto presentano DN massimo pari a {tubazioni.dnMassimo} mm, superiore alla soglia di 80 mm dell’art. 3 comma bb): rientrano pertanto nel campo di applicazione del D.M. 329/2004 e sono soggette ai relativi obblighi di denuncia.</w:t>
+      </w:r>
+    </w:p>
+    <w:p>
+      <w:pPr>
+        <w:spacing w:after="0"/>
+        <w:rPr>
+          <w:rFonts w:ascii="Segoe UI" w:hAnsi="Segoe UI" w:cs="Segoe UI"/>
+          <w:sz w:val="22"/>
+          <w:szCs w:val="22"/>
+        </w:rPr>
+      </w:pPr>
+      <w:r>
+        <w:rPr>
+          <w:rFonts w:ascii="Segoe UI" w:hAnsi="Segoe UI" w:cs="Segoe UI"/>
+          <w:sz w:val="22"/>
+          <w:szCs w:val="22"/>
+        </w:rPr>
+        <w:t>{/tubazioni.escluse}</w:t>
+      </w:r>
+    </w:p>
+    <w:p>
+      <w:pPr>
+        <w:pStyle w:val="Titolo1"/>
+      </w:pPr>
+      <w:r>
         <w:lastRenderedPageBreak/>
-        <w:t>compressori sono esclusi dal campo di applicazione del D.M. 329/2004 in base a quanto previsto dall’art. 1, comma 3, lettera L del D.lgs. 93/2000.</w:t>
-      </w:r>
-    </w:p>
-    <w:p>
-      <w:pPr>
-        <w:spacing w:after="0"/>
-        <w:rPr>
-          <w:rFonts w:ascii="Segoe UI" w:hAnsi="Segoe UI" w:cs="Segoe UI"/>
-          <w:sz w:val="22"/>
-          <w:szCs w:val="22"/>
-        </w:rPr>
-      </w:pPr>
-      <w:r>
-        <w:rPr>
-          <w:rFonts w:ascii="Segoe UI" w:hAnsi="Segoe UI" w:cs="Segoe UI"/>
-          <w:sz w:val="22"/>
-          <w:szCs w:val="22"/>
-        </w:rPr>
-        <w:t>{#tubazioni.escluse}</w:t>
-      </w:r>
-    </w:p>
-    <w:p>
-      <w:pPr>
-        <w:rPr>
-          <w:rFonts w:ascii="Segoe UI" w:hAnsi="Segoe UI" w:cs="Segoe UI"/>
-          <w:sz w:val="22"/>
-          <w:szCs w:val="22"/>
-        </w:rPr>
-      </w:pPr>
-      <w:r>
-        <w:rPr>
-          <w:rFonts w:ascii="Segoe UI" w:hAnsi="Segoe UI" w:cs="Segoe UI"/>
-          <w:sz w:val="22"/>
-          <w:szCs w:val="22"/>
-        </w:rPr>
-        <w:t>Tutte le tubazioni destinate a contenere aria compressa hanno DN ≤ 80 mm e sono pertanto escluse dal campo di applicazione del D.M. 329/2004 ai sensi dell’art. 3 comma bb) del medesimo decreto.</w:t>
-      </w:r>
-    </w:p>
-    <w:p>
-      <w:pPr>
-        <w:spacing w:after="0"/>
-        <w:rPr>
-          <w:rFonts w:ascii="Segoe UI" w:hAnsi="Segoe UI" w:cs="Segoe UI"/>
-          <w:sz w:val="22"/>
-          <w:szCs w:val="22"/>
-        </w:rPr>
-      </w:pPr>
-      <w:r>
-        <w:rPr>
-          <w:rFonts w:ascii="Segoe UI" w:hAnsi="Segoe UI" w:cs="Segoe UI"/>
-          <w:sz w:val="22"/>
-          <w:szCs w:val="22"/>
-        </w:rPr>
-        <w:t>{/tubazioni.escluse}</w:t>
-      </w:r>
-    </w:p>
-    <w:p>
-      <w:pPr>
-        <w:spacing w:after="0"/>
-        <w:rPr>
-          <w:rFonts w:ascii="Segoe UI" w:hAnsi="Segoe UI" w:cs="Segoe UI"/>
-          <w:sz w:val="22"/>
-          <w:szCs w:val="22"/>
-        </w:rPr>
-      </w:pPr>
-      <w:r>
-        <w:rPr>
-          <w:rFonts w:ascii="Segoe UI" w:hAnsi="Segoe UI" w:cs="Segoe UI"/>
-          <w:sz w:val="22"/>
-          <w:szCs w:val="22"/>
-        </w:rPr>
-        <w:t>{^tubazioni.escluse}</w:t>
-      </w:r>
-    </w:p>
-    <w:p>
-      <w:pPr>
-        <w:rPr>
-          <w:rFonts w:ascii="Segoe UI" w:hAnsi="Segoe UI" w:cs="Segoe UI"/>
-          <w:sz w:val="22"/>
-          <w:szCs w:val="22"/>
-        </w:rPr>
-      </w:pPr>
-      <w:r>
-        <w:rPr>
-          <w:rFonts w:ascii="Segoe UI" w:hAnsi="Segoe UI" w:cs="Segoe UI"/>
-          <w:sz w:val="22"/>
-          <w:szCs w:val="22"/>
-          <w:highlight w:val="yellow"/>
-        </w:rPr>
-        <w:t>Le tubazioni dell’impianto presentano DN massimo pari a {tubazioni.dnMassimo} mm, superiore alla soglia di 80 mm dell’art. 3 comma bb): rientrano pertanto nel campo di applicazione del D.M. 329/2004 e sono soggette ai relativi obblighi di denuncia.</w:t>
-      </w:r>
-    </w:p>
-    <w:p>
-      <w:pPr>
-        <w:spacing w:after="0"/>
-        <w:rPr>
-          <w:rFonts w:ascii="Segoe UI" w:hAnsi="Segoe UI" w:cs="Segoe UI"/>
-          <w:sz w:val="22"/>
-          <w:szCs w:val="22"/>
-        </w:rPr>
-      </w:pPr>
-      <w:r>
-        <w:rPr>
-          <w:rFonts w:ascii="Segoe UI" w:hAnsi="Segoe UI" w:cs="Segoe UI"/>
-          <w:sz w:val="22"/>
-          <w:szCs w:val="22"/>
-        </w:rPr>
-        <w:t>{/tubazioni.escluse}</w:t>
-      </w:r>
-    </w:p>
-    <w:p>
-      <w:pPr>
-        <w:pStyle w:val="Titolo1"/>
-      </w:pPr>
-      <w:r>
         <w:t>6. Verifica delle valvole di sicurezza</w:t>
       </w:r>
     </w:p>
@@ -4298,12 +4332,12 @@
         <w:tblLook w:val="0000" w:firstRow="0" w:lastRow="0" w:firstColumn="0" w:lastColumn="0" w:noHBand="0" w:noVBand="0"/>
       </w:tblPr>
       <w:tblGrid>
-        <w:gridCol w:w="911"/>
-        <w:gridCol w:w="1415"/>
-        <w:gridCol w:w="3622"/>
-        <w:gridCol w:w="1560"/>
-        <w:gridCol w:w="1277"/>
-        <w:gridCol w:w="843"/>
+        <w:gridCol w:w="2073"/>
+        <w:gridCol w:w="1343"/>
+        <w:gridCol w:w="1292"/>
+        <w:gridCol w:w="1342"/>
+        <w:gridCol w:w="1290"/>
+        <w:gridCol w:w="2288"/>
       </w:tblGrid>
       <w:tr>
         <w:trPr>
@@ -4793,12 +4827,12 @@
         <w:tblLook w:val="0000" w:firstRow="0" w:lastRow="0" w:firstColumn="0" w:lastColumn="0" w:noHBand="0" w:noVBand="0"/>
       </w:tblPr>
       <w:tblGrid>
-        <w:gridCol w:w="1030"/>
-        <w:gridCol w:w="1379"/>
-        <w:gridCol w:w="3539"/>
-        <w:gridCol w:w="1560"/>
-        <w:gridCol w:w="1277"/>
-        <w:gridCol w:w="843"/>
+        <w:gridCol w:w="2266"/>
+        <w:gridCol w:w="1369"/>
+        <w:gridCol w:w="991"/>
+        <w:gridCol w:w="1090"/>
+        <w:gridCol w:w="1427"/>
+        <w:gridCol w:w="2485"/>
       </w:tblGrid>
       <w:tr>
         <w:trPr>
@@ -5210,6 +5244,7 @@
         <w:pStyle w:val="Titolo1"/>
       </w:pPr>
       <w:r>
+        <w:lastRenderedPageBreak/>
         <w:t>7. Riqualificazione periodica</w:t>
       </w:r>
     </w:p>
@@ -5550,11 +5585,11 @@
         <w:tblLook w:val="0000" w:firstRow="0" w:lastRow="0" w:firstColumn="0" w:lastColumn="0" w:noHBand="0" w:noVBand="0"/>
       </w:tblPr>
       <w:tblGrid>
-        <w:gridCol w:w="917"/>
-        <w:gridCol w:w="3208"/>
-        <w:gridCol w:w="917"/>
-        <w:gridCol w:w="2291"/>
-        <w:gridCol w:w="2295"/>
+        <w:gridCol w:w="2000"/>
+        <w:gridCol w:w="1579"/>
+        <w:gridCol w:w="1025"/>
+        <w:gridCol w:w="2100"/>
+        <w:gridCol w:w="2924"/>
       </w:tblGrid>
       <w:tr>
         <w:trPr>
@@ -5585,7 +5620,6 @@
                 <w:sz w:val="22"/>
                 <w:szCs w:val="22"/>
               </w:rPr>
-              <w:lastRenderedPageBreak/>
               <w:t>Pos.</w:t>
             </w:r>
           </w:p>
@@ -5860,19 +5894,7 @@
         <w:rPr>
           <w:rFonts w:ascii="Segoe UI" w:hAnsi="Segoe UI" w:cs="Segoe UI"/>
         </w:rPr>
-        <w:t xml:space="preserve">Come già evidenziato nella tabella al paragrafo 5.2, in considerazione della data di produzione e delle frequenze delle verifiche di integrità, </w:t>
-      </w:r>
-      <w:r>
-        <w:rPr>
-          <w:rFonts w:ascii="Segoe UI" w:hAnsi="Segoe UI" w:cs="Segoe UI"/>
-        </w:rPr>
-        <w:t>{spessimetriche.clausola}</w:t>
-      </w:r>
-      <w:r>
-        <w:rPr>
-          <w:rFonts w:ascii="Segoe UI" w:hAnsi="Segoe UI" w:cs="Segoe UI"/>
-        </w:rPr>
-        <w:t xml:space="preserve"> a verifica spessimetrica, con esito positivo.</w:t>
+        <w:t>Come già evidenziato nella tabella al paragrafo 5.2, in considerazione della data di produzione e delle frequenze delle verifiche di integrità, {spessimetriche.clausola} a verifica spessimetrica, con esito positivo.</w:t>
       </w:r>
     </w:p>
     <w:p>
@@ -5962,8 +5984,8 @@
       </w:r>
     </w:p>
     <w:sectPr>
-      <w:footerReference w:type="default" r:id="rId19"/>
-      <w:footerReference w:type="first" r:id="rId20"/>
+      <w:footerReference w:type="default" r:id="rId14"/>
+      <w:footerReference w:type="first" r:id="rId15"/>
       <w:type w:val="continuous"/>
       <w:pgSz w:w="11906" w:h="16838"/>
       <w:pgMar w:top="1134" w:right="1134" w:bottom="1134" w:left="1134" w:header="708" w:footer="428" w:gutter="0"/>
@@ -5976,7 +5998,7 @@
 </file>
 
 <file path=word/endnotes.xml><?xml version="1.0" encoding="utf-8"?>
-<w:endnotes xmlns:wpc="http://schemas.microsoft.com/office/word/2010/wordprocessingCanvas" xmlns:cx="http://schemas.microsoft.com/office/drawing/2014/chartex" xmlns:cx1="http://schemas.microsoft.com/office/drawing/2015/9/8/chartex" xmlns:cx2="http://schemas.microsoft.com/office/drawing/2015/10/21/chartex" xmlns:cx3="http://schemas.microsoft.com/office/drawing/2016/5/9/chartex" xmlns:cx4="http://schemas.microsoft.com/office/drawing/2016/5/10/chartex" xmlns:cx5="http://schemas.microsoft.com/office/drawing/2016/5/11/chartex" xmlns:cx6="http://schemas.microsoft.com/office/drawing/2016/5/12/chartex" xmlns:cx7="http://schemas.microsoft.com/office/drawing/2016/5/13/chartex" xmlns:cx8="http://schemas.microsoft.com/office/drawing/2016/5/14/chartex" xmlns:mc="http://schemas.openxmlformats.org/markup-compatibility/2006" xmlns:aink="http://schemas.microsoft.com/office/drawing/2016/ink" xmlns:am3d="http://schemas.microsoft.com/office/drawing/2017/model3d" xmlns:o="urn:schemas-microsoft-com:office:office" xmlns:oel="http://schemas.microsoft.com/office/2019/extlst" xmlns:r="http://schemas.openxmlformats.org/officeDocument/2006/relationships" xmlns:m="http://schemas.openxmlformats.org/officeDocument/2006/math" xmlns:v="urn:schemas-microsoft-com:vml" xmlns:wp14="http://schemas.microsoft.com/office/word/2010/wordprocessingDrawing" xmlns:wp="http://schemas.openxmlformats.org/drawingml/2006/wordprocessingDrawing" xmlns:w10="urn:schemas-microsoft-com:office:word" xmlns:w="http://schemas.openxmlformats.org/wordprocessingml/2006/main" xmlns:w14="http://schemas.microsoft.com/office/word/2010/wordml" xmlns:w15="http://schemas.microsoft.com/office/word/2012/wordml" xmlns:w16cei="http://schemas.microsoft.com/office/word/2026/wordml/cei" xmlns:w16cex="http://schemas.microsoft.com/office/word/2018/wordml/cex" xmlns:w16cid="http://schemas.microsoft.com/office/word/2016/wordml/cid" xmlns:w16="http://schemas.microsoft.com/office/word/2018/wordml" xmlns:w16du="http://schemas.microsoft.com/office/word/2023/wordml/word16du" xmlns:w16sdtdh="http://schemas.microsoft.com/office/word/2020/wordml/sdtdatahash" xmlns:w16sdtfl="http://schemas.microsoft.com/office/word/2024/wordml/sdtformatlock" xmlns:w16se="http://schemas.microsoft.com/office/word/2015/wordml/symex" xmlns:wpg="http://schemas.microsoft.com/office/word/2010/wordprocessingGroup" xmlns:wpi="http://schemas.microsoft.com/office/word/2010/wordprocessingInk" xmlns:wne="http://schemas.microsoft.com/office/word/2006/wordml" xmlns:wps="http://schemas.microsoft.com/office/word/2010/wordprocessingShape" mc:Ignorable="w14 w15 w16se w16cid w16 w16cex w16sdtdh w16sdtfl w16du wp14">
+<w:endnotes xmlns:wpc="http://schemas.microsoft.com/office/word/2010/wordprocessingCanvas" xmlns:cx="http://schemas.microsoft.com/office/drawing/2014/chartex" xmlns:cx1="http://schemas.microsoft.com/office/drawing/2015/9/8/chartex" xmlns:cx2="http://schemas.microsoft.com/office/drawing/2015/10/21/chartex" xmlns:cx3="http://schemas.microsoft.com/office/drawing/2016/5/9/chartex" xmlns:cx4="http://schemas.microsoft.com/office/drawing/2016/5/10/chartex" xmlns:cx5="http://schemas.microsoft.com/office/drawing/2016/5/11/chartex" xmlns:cx6="http://schemas.microsoft.com/office/drawing/2016/5/12/chartex" xmlns:cx7="http://schemas.microsoft.com/office/drawing/2016/5/13/chartex" xmlns:cx8="http://schemas.microsoft.com/office/drawing/2016/5/14/chartex" xmlns:mc="http://schemas.openxmlformats.org/markup-compatibility/2006" xmlns:aink="http://schemas.microsoft.com/office/drawing/2016/ink" xmlns:am3d="http://schemas.microsoft.com/office/drawing/2017/model3d" xmlns:o="urn:schemas-microsoft-com:office:office" xmlns:oel="http://schemas.microsoft.com/office/2019/extlst" xmlns:r="http://schemas.openxmlformats.org/officeDocument/2006/relationships" xmlns:m="http://schemas.openxmlformats.org/officeDocument/2006/math" xmlns:v="urn:schemas-microsoft-com:vml" xmlns:wp14="http://schemas.microsoft.com/office/word/2010/wordprocessingDrawing" xmlns:wp="http://schemas.openxmlformats.org/drawingml/2006/wordprocessingDrawing" xmlns:w10="urn:schemas-microsoft-com:office:word" xmlns:w="http://schemas.openxmlformats.org/wordprocessingml/2006/main" xmlns:w14="http://schemas.microsoft.com/office/word/2010/wordml" xmlns:w15="http://schemas.microsoft.com/office/word/2012/wordml" xmlns:w16cex="http://schemas.microsoft.com/office/word/2018/wordml/cex" xmlns:w16cid="http://schemas.microsoft.com/office/word/2016/wordml/cid" xmlns:w16="http://schemas.microsoft.com/office/word/2018/wordml" xmlns:w16du="http://schemas.microsoft.com/office/word/2023/wordml/word16du" xmlns:w16sdtdh="http://schemas.microsoft.com/office/word/2020/wordml/sdtdatahash" xmlns:w16sdtfl="http://schemas.microsoft.com/office/word/2024/wordml/sdtformatlock" xmlns:w16se="http://schemas.microsoft.com/office/word/2015/wordml/symex" xmlns:wpg="http://schemas.microsoft.com/office/word/2010/wordprocessingGroup" xmlns:wpi="http://schemas.microsoft.com/office/word/2010/wordprocessingInk" xmlns:wne="http://schemas.microsoft.com/office/word/2006/wordml" xmlns:wps="http://schemas.microsoft.com/office/word/2010/wordprocessingShape" mc:Ignorable="w14 w15 w16se w16cid w16 w16cex w16sdtdh w16sdtfl w16du wp14">
   <w:endnote w:type="separator" w:id="-1">
     <w:p>
       <w:pPr>
@@ -6001,7 +6023,7 @@
 </file>
 
 <file path=word/footer1.xml><?xml version="1.0" encoding="utf-8"?>
-<w:ftr xmlns:wpc="http://schemas.microsoft.com/office/word/2010/wordprocessingCanvas" xmlns:cx="http://schemas.microsoft.com/office/drawing/2014/chartex" xmlns:cx1="http://schemas.microsoft.com/office/drawing/2015/9/8/chartex" xmlns:cx2="http://schemas.microsoft.com/office/drawing/2015/10/21/chartex" xmlns:cx3="http://schemas.microsoft.com/office/drawing/2016/5/9/chartex" xmlns:cx4="http://schemas.microsoft.com/office/drawing/2016/5/10/chartex" xmlns:cx5="http://schemas.microsoft.com/office/drawing/2016/5/11/chartex" xmlns:cx6="http://schemas.microsoft.com/office/drawing/2016/5/12/chartex" xmlns:cx7="http://schemas.microsoft.com/office/drawing/2016/5/13/chartex" xmlns:cx8="http://schemas.microsoft.com/office/drawing/2016/5/14/chartex" xmlns:mc="http://schemas.openxmlformats.org/markup-compatibility/2006" xmlns:aink="http://schemas.microsoft.com/office/drawing/2016/ink" xmlns:am3d="http://schemas.microsoft.com/office/drawing/2017/model3d" xmlns:o="urn:schemas-microsoft-com:office:office" xmlns:oel="http://schemas.microsoft.com/office/2019/extlst" xmlns:r="http://schemas.openxmlformats.org/officeDocument/2006/relationships" xmlns:m="http://schemas.openxmlformats.org/officeDocument/2006/math" xmlns:v="urn:schemas-microsoft-com:vml" xmlns:wp14="http://schemas.microsoft.com/office/word/2010/wordprocessingDrawing" xmlns:wp="http://schemas.openxmlformats.org/drawingml/2006/wordprocessingDrawing" xmlns:w10="urn:schemas-microsoft-com:office:word" xmlns:w="http://schemas.openxmlformats.org/wordprocessingml/2006/main" xmlns:w14="http://schemas.microsoft.com/office/word/2010/wordml" xmlns:w15="http://schemas.microsoft.com/office/word/2012/wordml" xmlns:w16cei="http://schemas.microsoft.com/office/word/2026/wordml/cei" xmlns:w16cex="http://schemas.microsoft.com/office/word/2018/wordml/cex" xmlns:w16cid="http://schemas.microsoft.com/office/word/2016/wordml/cid" xmlns:w16="http://schemas.microsoft.com/office/word/2018/wordml" xmlns:w16du="http://schemas.microsoft.com/office/word/2023/wordml/word16du" xmlns:w16sdtdh="http://schemas.microsoft.com/office/word/2020/wordml/sdtdatahash" xmlns:w16sdtfl="http://schemas.microsoft.com/office/word/2024/wordml/sdtformatlock" xmlns:w16se="http://schemas.microsoft.com/office/word/2015/wordml/symex" xmlns:wpg="http://schemas.microsoft.com/office/word/2010/wordprocessingGroup" xmlns:wpi="http://schemas.microsoft.com/office/word/2010/wordprocessingInk" xmlns:wne="http://schemas.microsoft.com/office/word/2006/wordml" xmlns:wps="http://schemas.microsoft.com/office/word/2010/wordprocessingShape" mc:Ignorable="w14 w15 w16se w16cid w16 w16cex w16sdtdh w16sdtfl w16du wp14">
+<w:ftr xmlns:wpc="http://schemas.microsoft.com/office/word/2010/wordprocessingCanvas" xmlns:cx="http://schemas.microsoft.com/office/drawing/2014/chartex" xmlns:cx1="http://schemas.microsoft.com/office/drawing/2015/9/8/chartex" xmlns:cx2="http://schemas.microsoft.com/office/drawing/2015/10/21/chartex" xmlns:cx3="http://schemas.microsoft.com/office/drawing/2016/5/9/chartex" xmlns:cx4="http://schemas.microsoft.com/office/drawing/2016/5/10/chartex" xmlns:cx5="http://schemas.microsoft.com/office/drawing/2016/5/11/chartex" xmlns:cx6="http://schemas.microsoft.com/office/drawing/2016/5/12/chartex" xmlns:cx7="http://schemas.microsoft.com/office/drawing/2016/5/13/chartex" xmlns:cx8="http://schemas.microsoft.com/office/drawing/2016/5/14/chartex" xmlns:mc="http://schemas.openxmlformats.org/markup-compatibility/2006" xmlns:aink="http://schemas.microsoft.com/office/drawing/2016/ink" xmlns:am3d="http://schemas.microsoft.com/office/drawing/2017/model3d" xmlns:o="urn:schemas-microsoft-com:office:office" xmlns:oel="http://schemas.microsoft.com/office/2019/extlst" xmlns:r="http://schemas.openxmlformats.org/officeDocument/2006/relationships" xmlns:m="http://schemas.openxmlformats.org/officeDocument/2006/math" xmlns:v="urn:schemas-microsoft-com:vml" xmlns:wp14="http://schemas.microsoft.com/office/word/2010/wordprocessingDrawing" xmlns:wp="http://schemas.openxmlformats.org/drawingml/2006/wordprocessingDrawing" xmlns:w10="urn:schemas-microsoft-com:office:word" xmlns:w="http://schemas.openxmlformats.org/wordprocessingml/2006/main" xmlns:w14="http://schemas.microsoft.com/office/word/2010/wordml" xmlns:w15="http://schemas.microsoft.com/office/word/2012/wordml" xmlns:w16cex="http://schemas.microsoft.com/office/word/2018/wordml/cex" xmlns:w16cid="http://schemas.microsoft.com/office/word/2016/wordml/cid" xmlns:w16="http://schemas.microsoft.com/office/word/2018/wordml" xmlns:w16du="http://schemas.microsoft.com/office/word/2023/wordml/word16du" xmlns:w16sdtdh="http://schemas.microsoft.com/office/word/2020/wordml/sdtdatahash" xmlns:w16sdtfl="http://schemas.microsoft.com/office/word/2024/wordml/sdtformatlock" xmlns:w16se="http://schemas.microsoft.com/office/word/2015/wordml/symex" xmlns:wpg="http://schemas.microsoft.com/office/word/2010/wordprocessingGroup" xmlns:wpi="http://schemas.microsoft.com/office/word/2010/wordprocessingInk" xmlns:wne="http://schemas.microsoft.com/office/word/2006/wordml" xmlns:wps="http://schemas.microsoft.com/office/word/2010/wordprocessingShape" mc:Ignorable="w14 w15 w16se w16cid w16 w16cex w16sdtdh w16sdtfl w16du wp14">
   <w:p>
     <w:pPr>
       <w:pStyle w:val="Pidipagina"/>
@@ -6011,7 +6033,7 @@
 </file>
 
 <file path=word/footer2.xml><?xml version="1.0" encoding="utf-8"?>
-<w:ftr xmlns:wpc="http://schemas.microsoft.com/office/word/2010/wordprocessingCanvas" xmlns:cx="http://schemas.microsoft.com/office/drawing/2014/chartex" xmlns:cx1="http://schemas.microsoft.com/office/drawing/2015/9/8/chartex" xmlns:cx2="http://schemas.microsoft.com/office/drawing/2015/10/21/chartex" xmlns:cx3="http://schemas.microsoft.com/office/drawing/2016/5/9/chartex" xmlns:cx4="http://schemas.microsoft.com/office/drawing/2016/5/10/chartex" xmlns:cx5="http://schemas.microsoft.com/office/drawing/2016/5/11/chartex" xmlns:cx6="http://schemas.microsoft.com/office/drawing/2016/5/12/chartex" xmlns:cx7="http://schemas.microsoft.com/office/drawing/2016/5/13/chartex" xmlns:cx8="http://schemas.microsoft.com/office/drawing/2016/5/14/chartex" xmlns:mc="http://schemas.openxmlformats.org/markup-compatibility/2006" xmlns:aink="http://schemas.microsoft.com/office/drawing/2016/ink" xmlns:am3d="http://schemas.microsoft.com/office/drawing/2017/model3d" xmlns:o="urn:schemas-microsoft-com:office:office" xmlns:oel="http://schemas.microsoft.com/office/2019/extlst" xmlns:r="http://schemas.openxmlformats.org/officeDocument/2006/relationships" xmlns:m="http://schemas.openxmlformats.org/officeDocument/2006/math" xmlns:v="urn:schemas-microsoft-com:vml" xmlns:wp14="http://schemas.microsoft.com/office/word/2010/wordprocessingDrawing" xmlns:wp="http://schemas.openxmlformats.org/drawingml/2006/wordprocessingDrawing" xmlns:w10="urn:schemas-microsoft-com:office:word" xmlns:w="http://schemas.openxmlformats.org/wordprocessingml/2006/main" xmlns:w14="http://schemas.microsoft.com/office/word/2010/wordml" xmlns:w15="http://schemas.microsoft.com/office/word/2012/wordml" xmlns:w16cei="http://schemas.microsoft.com/office/word/2026/wordml/cei" xmlns:w16cex="http://schemas.microsoft.com/office/word/2018/wordml/cex" xmlns:w16cid="http://schemas.microsoft.com/office/word/2016/wordml/cid" xmlns:w16="http://schemas.microsoft.com/office/word/2018/wordml" xmlns:w16du="http://schemas.microsoft.com/office/word/2023/wordml/word16du" xmlns:w16sdtdh="http://schemas.microsoft.com/office/word/2020/wordml/sdtdatahash" xmlns:w16sdtfl="http://schemas.microsoft.com/office/word/2024/wordml/sdtformatlock" xmlns:w16se="http://schemas.microsoft.com/office/word/2015/wordml/symex" xmlns:wpg="http://schemas.microsoft.com/office/word/2010/wordprocessingGroup" xmlns:wpi="http://schemas.microsoft.com/office/word/2010/wordprocessingInk" xmlns:wne="http://schemas.microsoft.com/office/word/2006/wordml" xmlns:wps="http://schemas.microsoft.com/office/word/2010/wordprocessingShape" mc:Ignorable="w14 w15 w16se w16cid w16 w16cex w16sdtdh w16sdtfl w16du wp14">
+<w:ftr xmlns:wpc="http://schemas.microsoft.com/office/word/2010/wordprocessingCanvas" xmlns:cx="http://schemas.microsoft.com/office/drawing/2014/chartex" xmlns:cx1="http://schemas.microsoft.com/office/drawing/2015/9/8/chartex" xmlns:cx2="http://schemas.microsoft.com/office/drawing/2015/10/21/chartex" xmlns:cx3="http://schemas.microsoft.com/office/drawing/2016/5/9/chartex" xmlns:cx4="http://schemas.microsoft.com/office/drawing/2016/5/10/chartex" xmlns:cx5="http://schemas.microsoft.com/office/drawing/2016/5/11/chartex" xmlns:cx6="http://schemas.microsoft.com/office/drawing/2016/5/12/chartex" xmlns:cx7="http://schemas.microsoft.com/office/drawing/2016/5/13/chartex" xmlns:cx8="http://schemas.microsoft.com/office/drawing/2016/5/14/chartex" xmlns:mc="http://schemas.openxmlformats.org/markup-compatibility/2006" xmlns:aink="http://schemas.microsoft.com/office/drawing/2016/ink" xmlns:am3d="http://schemas.microsoft.com/office/drawing/2017/model3d" xmlns:o="urn:schemas-microsoft-com:office:office" xmlns:oel="http://schemas.microsoft.com/office/2019/extlst" xmlns:r="http://schemas.openxmlformats.org/officeDocument/2006/relationships" xmlns:m="http://schemas.openxmlformats.org/officeDocument/2006/math" xmlns:v="urn:schemas-microsoft-com:vml" xmlns:wp14="http://schemas.microsoft.com/office/word/2010/wordprocessingDrawing" xmlns:wp="http://schemas.openxmlformats.org/drawingml/2006/wordprocessingDrawing" xmlns:w10="urn:schemas-microsoft-com:office:word" xmlns:w="http://schemas.openxmlformats.org/wordprocessingml/2006/main" xmlns:w14="http://schemas.microsoft.com/office/word/2010/wordml" xmlns:w15="http://schemas.microsoft.com/office/word/2012/wordml" xmlns:w16cex="http://schemas.microsoft.com/office/word/2018/wordml/cex" xmlns:w16cid="http://schemas.microsoft.com/office/word/2016/wordml/cid" xmlns:w16="http://schemas.microsoft.com/office/word/2018/wordml" xmlns:w16du="http://schemas.microsoft.com/office/word/2023/wordml/word16du" xmlns:w16sdtdh="http://schemas.microsoft.com/office/word/2020/wordml/sdtdatahash" xmlns:w16sdtfl="http://schemas.microsoft.com/office/word/2024/wordml/sdtformatlock" xmlns:w16se="http://schemas.microsoft.com/office/word/2015/wordml/symex" xmlns:wpg="http://schemas.microsoft.com/office/word/2010/wordprocessingGroup" xmlns:wpi="http://schemas.microsoft.com/office/word/2010/wordprocessingInk" xmlns:wne="http://schemas.microsoft.com/office/word/2006/wordml" xmlns:wps="http://schemas.microsoft.com/office/word/2010/wordprocessingShape" mc:Ignorable="w14 w15 w16se w16cid w16 w16cex w16sdtdh w16sdtfl w16du wp14">
   <w:tbl>
     <w:tblPr>
       <w:tblW w:w="9638" w:type="dxa"/>
@@ -6423,7 +6445,7 @@
 </file>
 
 <file path=word/footer3.xml><?xml version="1.0" encoding="utf-8"?>
-<w:ftr xmlns:wpc="http://schemas.microsoft.com/office/word/2010/wordprocessingCanvas" xmlns:cx="http://schemas.microsoft.com/office/drawing/2014/chartex" xmlns:cx1="http://schemas.microsoft.com/office/drawing/2015/9/8/chartex" xmlns:cx2="http://schemas.microsoft.com/office/drawing/2015/10/21/chartex" xmlns:cx3="http://schemas.microsoft.com/office/drawing/2016/5/9/chartex" xmlns:cx4="http://schemas.microsoft.com/office/drawing/2016/5/10/chartex" xmlns:cx5="http://schemas.microsoft.com/office/drawing/2016/5/11/chartex" xmlns:cx6="http://schemas.microsoft.com/office/drawing/2016/5/12/chartex" xmlns:cx7="http://schemas.microsoft.com/office/drawing/2016/5/13/chartex" xmlns:cx8="http://schemas.microsoft.com/office/drawing/2016/5/14/chartex" xmlns:mc="http://schemas.openxmlformats.org/markup-compatibility/2006" xmlns:aink="http://schemas.microsoft.com/office/drawing/2016/ink" xmlns:am3d="http://schemas.microsoft.com/office/drawing/2017/model3d" xmlns:o="urn:schemas-microsoft-com:office:office" xmlns:oel="http://schemas.microsoft.com/office/2019/extlst" xmlns:r="http://schemas.openxmlformats.org/officeDocument/2006/relationships" xmlns:m="http://schemas.openxmlformats.org/officeDocument/2006/math" xmlns:v="urn:schemas-microsoft-com:vml" xmlns:wp14="http://schemas.microsoft.com/office/word/2010/wordprocessingDrawing" xmlns:wp="http://schemas.openxmlformats.org/drawingml/2006/wordprocessingDrawing" xmlns:w10="urn:schemas-microsoft-com:office:word" xmlns:w="http://schemas.openxmlformats.org/wordprocessingml/2006/main" xmlns:w14="http://schemas.microsoft.com/office/word/2010/wordml" xmlns:w15="http://schemas.microsoft.com/office/word/2012/wordml" xmlns:w16cei="http://schemas.microsoft.com/office/word/2026/wordml/cei" xmlns:w16cex="http://schemas.microsoft.com/office/word/2018/wordml/cex" xmlns:w16cid="http://schemas.microsoft.com/office/word/2016/wordml/cid" xmlns:w16="http://schemas.microsoft.com/office/word/2018/wordml" xmlns:w16du="http://schemas.microsoft.com/office/word/2023/wordml/word16du" xmlns:w16sdtdh="http://schemas.microsoft.com/office/word/2020/wordml/sdtdatahash" xmlns:w16sdtfl="http://schemas.microsoft.com/office/word/2024/wordml/sdtformatlock" xmlns:w16se="http://schemas.microsoft.com/office/word/2015/wordml/symex" xmlns:wpg="http://schemas.microsoft.com/office/word/2010/wordprocessingGroup" xmlns:wpi="http://schemas.microsoft.com/office/word/2010/wordprocessingInk" xmlns:wne="http://schemas.microsoft.com/office/word/2006/wordml" xmlns:wps="http://schemas.microsoft.com/office/word/2010/wordprocessingShape" mc:Ignorable="w14 w15 w16se w16cid w16 w16cex w16sdtdh w16sdtfl w16du wp14">
+<w:ftr xmlns:wpc="http://schemas.microsoft.com/office/word/2010/wordprocessingCanvas" xmlns:cx="http://schemas.microsoft.com/office/drawing/2014/chartex" xmlns:cx1="http://schemas.microsoft.com/office/drawing/2015/9/8/chartex" xmlns:cx2="http://schemas.microsoft.com/office/drawing/2015/10/21/chartex" xmlns:cx3="http://schemas.microsoft.com/office/drawing/2016/5/9/chartex" xmlns:cx4="http://schemas.microsoft.com/office/drawing/2016/5/10/chartex" xmlns:cx5="http://schemas.microsoft.com/office/drawing/2016/5/11/chartex" xmlns:cx6="http://schemas.microsoft.com/office/drawing/2016/5/12/chartex" xmlns:cx7="http://schemas.microsoft.com/office/drawing/2016/5/13/chartex" xmlns:cx8="http://schemas.microsoft.com/office/drawing/2016/5/14/chartex" xmlns:mc="http://schemas.openxmlformats.org/markup-compatibility/2006" xmlns:aink="http://schemas.microsoft.com/office/drawing/2016/ink" xmlns:am3d="http://schemas.microsoft.com/office/drawing/2017/model3d" xmlns:o="urn:schemas-microsoft-com:office:office" xmlns:oel="http://schemas.microsoft.com/office/2019/extlst" xmlns:r="http://schemas.openxmlformats.org/officeDocument/2006/relationships" xmlns:m="http://schemas.openxmlformats.org/officeDocument/2006/math" xmlns:v="urn:schemas-microsoft-com:vml" xmlns:wp14="http://schemas.microsoft.com/office/word/2010/wordprocessingDrawing" xmlns:wp="http://schemas.openxmlformats.org/drawingml/2006/wordprocessingDrawing" xmlns:w10="urn:schemas-microsoft-com:office:word" xmlns:w="http://schemas.openxmlformats.org/wordprocessingml/2006/main" xmlns:w14="http://schemas.microsoft.com/office/word/2010/wordml" xmlns:w15="http://schemas.microsoft.com/office/word/2012/wordml" xmlns:w16cex="http://schemas.microsoft.com/office/word/2018/wordml/cex" xmlns:w16cid="http://schemas.microsoft.com/office/word/2016/wordml/cid" xmlns:w16="http://schemas.microsoft.com/office/word/2018/wordml" xmlns:w16du="http://schemas.microsoft.com/office/word/2023/wordml/word16du" xmlns:w16sdtdh="http://schemas.microsoft.com/office/word/2020/wordml/sdtdatahash" xmlns:w16sdtfl="http://schemas.microsoft.com/office/word/2024/wordml/sdtformatlock" xmlns:w16se="http://schemas.microsoft.com/office/word/2015/wordml/symex" xmlns:wpg="http://schemas.microsoft.com/office/word/2010/wordprocessingGroup" xmlns:wpi="http://schemas.microsoft.com/office/word/2010/wordprocessingInk" xmlns:wne="http://schemas.microsoft.com/office/word/2006/wordml" xmlns:wps="http://schemas.microsoft.com/office/word/2010/wordprocessingShape" mc:Ignorable="w14 w15 w16se w16cid w16 w16cex w16sdtdh w16sdtfl w16du wp14">
   <w:sdt>
     <w:sdtPr>
       <w:id w:val="-1797523648"/>
@@ -6460,7 +6482,7 @@
 </file>
 
 <file path=word/footer4.xml><?xml version="1.0" encoding="utf-8"?>
-<w:ftr xmlns:wpc="http://schemas.microsoft.com/office/word/2010/wordprocessingCanvas" xmlns:cx="http://schemas.microsoft.com/office/drawing/2014/chartex" xmlns:cx1="http://schemas.microsoft.com/office/drawing/2015/9/8/chartex" xmlns:cx2="http://schemas.microsoft.com/office/drawing/2015/10/21/chartex" xmlns:cx3="http://schemas.microsoft.com/office/drawing/2016/5/9/chartex" xmlns:cx4="http://schemas.microsoft.com/office/drawing/2016/5/10/chartex" xmlns:cx5="http://schemas.microsoft.com/office/drawing/2016/5/11/chartex" xmlns:cx6="http://schemas.microsoft.com/office/drawing/2016/5/12/chartex" xmlns:cx7="http://schemas.microsoft.com/office/drawing/2016/5/13/chartex" xmlns:cx8="http://schemas.microsoft.com/office/drawing/2016/5/14/chartex" xmlns:mc="http://schemas.openxmlformats.org/markup-compatibility/2006" xmlns:aink="http://schemas.microsoft.com/office/drawing/2016/ink" xmlns:am3d="http://schemas.microsoft.com/office/drawing/2017/model3d" xmlns:o="urn:schemas-microsoft-com:office:office" xmlns:oel="http://schemas.microsoft.com/office/2019/extlst" xmlns:r="http://schemas.openxmlformats.org/officeDocument/2006/relationships" xmlns:m="http://schemas.openxmlformats.org/officeDocument/2006/math" xmlns:v="urn:schemas-microsoft-com:vml" xmlns:wp14="http://schemas.microsoft.com/office/word/2010/wordprocessingDrawing" xmlns:wp="http://schemas.openxmlformats.org/drawingml/2006/wordprocessingDrawing" xmlns:w10="urn:schemas-microsoft-com:office:word" xmlns:w="http://schemas.openxmlformats.org/wordprocessingml/2006/main" xmlns:w14="http://schemas.microsoft.com/office/word/2010/wordml" xmlns:w15="http://schemas.microsoft.com/office/word/2012/wordml" xmlns:w16cei="http://schemas.microsoft.com/office/word/2026/wordml/cei" xmlns:w16cex="http://schemas.microsoft.com/office/word/2018/wordml/cex" xmlns:w16cid="http://schemas.microsoft.com/office/word/2016/wordml/cid" xmlns:w16="http://schemas.microsoft.com/office/word/2018/wordml" xmlns:w16du="http://schemas.microsoft.com/office/word/2023/wordml/word16du" xmlns:w16sdtdh="http://schemas.microsoft.com/office/word/2020/wordml/sdtdatahash" xmlns:w16sdtfl="http://schemas.microsoft.com/office/word/2024/wordml/sdtformatlock" xmlns:w16se="http://schemas.microsoft.com/office/word/2015/wordml/symex" xmlns:wpg="http://schemas.microsoft.com/office/word/2010/wordprocessingGroup" xmlns:wpi="http://schemas.microsoft.com/office/word/2010/wordprocessingInk" xmlns:wne="http://schemas.microsoft.com/office/word/2006/wordml" xmlns:wps="http://schemas.microsoft.com/office/word/2010/wordprocessingShape" mc:Ignorable="w14 w15 w16se w16cid w16 w16cex w16sdtdh w16sdtfl w16du wp14">
+<w:ftr xmlns:wpc="http://schemas.microsoft.com/office/word/2010/wordprocessingCanvas" xmlns:cx="http://schemas.microsoft.com/office/drawing/2014/chartex" xmlns:cx1="http://schemas.microsoft.com/office/drawing/2015/9/8/chartex" xmlns:cx2="http://schemas.microsoft.com/office/drawing/2015/10/21/chartex" xmlns:cx3="http://schemas.microsoft.com/office/drawing/2016/5/9/chartex" xmlns:cx4="http://schemas.microsoft.com/office/drawing/2016/5/10/chartex" xmlns:cx5="http://schemas.microsoft.com/office/drawing/2016/5/11/chartex" xmlns:cx6="http://schemas.microsoft.com/office/drawing/2016/5/12/chartex" xmlns:cx7="http://schemas.microsoft.com/office/drawing/2016/5/13/chartex" xmlns:cx8="http://schemas.microsoft.com/office/drawing/2016/5/14/chartex" xmlns:mc="http://schemas.openxmlformats.org/markup-compatibility/2006" xmlns:aink="http://schemas.microsoft.com/office/drawing/2016/ink" xmlns:am3d="http://schemas.microsoft.com/office/drawing/2017/model3d" xmlns:o="urn:schemas-microsoft-com:office:office" xmlns:oel="http://schemas.microsoft.com/office/2019/extlst" xmlns:r="http://schemas.openxmlformats.org/officeDocument/2006/relationships" xmlns:m="http://schemas.openxmlformats.org/officeDocument/2006/math" xmlns:v="urn:schemas-microsoft-com:vml" xmlns:wp14="http://schemas.microsoft.com/office/word/2010/wordprocessingDrawing" xmlns:wp="http://schemas.openxmlformats.org/drawingml/2006/wordprocessingDrawing" xmlns:w10="urn:schemas-microsoft-com:office:word" xmlns:w="http://schemas.openxmlformats.org/wordprocessingml/2006/main" xmlns:w14="http://schemas.microsoft.com/office/word/2010/wordml" xmlns:w15="http://schemas.microsoft.com/office/word/2012/wordml" xmlns:w16cex="http://schemas.microsoft.com/office/word/2018/wordml/cex" xmlns:w16cid="http://schemas.microsoft.com/office/word/2016/wordml/cid" xmlns:w16="http://schemas.microsoft.com/office/word/2018/wordml" xmlns:w16du="http://schemas.microsoft.com/office/word/2023/wordml/word16du" xmlns:w16sdtdh="http://schemas.microsoft.com/office/word/2020/wordml/sdtdatahash" xmlns:w16sdtfl="http://schemas.microsoft.com/office/word/2024/wordml/sdtformatlock" xmlns:w16se="http://schemas.microsoft.com/office/word/2015/wordml/symex" xmlns:wpg="http://schemas.microsoft.com/office/word/2010/wordprocessingGroup" xmlns:wpi="http://schemas.microsoft.com/office/word/2010/wordprocessingInk" xmlns:wne="http://schemas.microsoft.com/office/word/2006/wordml" xmlns:wps="http://schemas.microsoft.com/office/word/2010/wordprocessingShape" mc:Ignorable="w14 w15 w16se w16cid w16 w16cex w16sdtdh w16sdtfl w16du wp14">
   <w:p>
     <w:pPr>
       <w:pStyle w:val="Pidipagina"/>
@@ -6501,7 +6523,7 @@
             <w:rPr>
               <w:noProof/>
             </w:rPr>
-            <w:t>10</w:t>
+            <w:t>8</w:t>
           </w:r>
         </w:fldSimple>
       </w:sdtContent>
@@ -6511,7 +6533,7 @@
 </file>
 
 <file path=word/footer5.xml><?xml version="1.0" encoding="utf-8"?>
-<w:ftr xmlns:wpc="http://schemas.microsoft.com/office/word/2010/wordprocessingCanvas" xmlns:cx="http://schemas.microsoft.com/office/drawing/2014/chartex" xmlns:cx1="http://schemas.microsoft.com/office/drawing/2015/9/8/chartex" xmlns:cx2="http://schemas.microsoft.com/office/drawing/2015/10/21/chartex" xmlns:cx3="http://schemas.microsoft.com/office/drawing/2016/5/9/chartex" xmlns:cx4="http://schemas.microsoft.com/office/drawing/2016/5/10/chartex" xmlns:cx5="http://schemas.microsoft.com/office/drawing/2016/5/11/chartex" xmlns:cx6="http://schemas.microsoft.com/office/drawing/2016/5/12/chartex" xmlns:cx7="http://schemas.microsoft.com/office/drawing/2016/5/13/chartex" xmlns:cx8="http://schemas.microsoft.com/office/drawing/2016/5/14/chartex" xmlns:mc="http://schemas.openxmlformats.org/markup-compatibility/2006" xmlns:aink="http://schemas.microsoft.com/office/drawing/2016/ink" xmlns:am3d="http://schemas.microsoft.com/office/drawing/2017/model3d" xmlns:o="urn:schemas-microsoft-com:office:office" xmlns:oel="http://schemas.microsoft.com/office/2019/extlst" xmlns:r="http://schemas.openxmlformats.org/officeDocument/2006/relationships" xmlns:m="http://schemas.openxmlformats.org/officeDocument/2006/math" xmlns:v="urn:schemas-microsoft-com:vml" xmlns:wp14="http://schemas.microsoft.com/office/word/2010/wordprocessingDrawing" xmlns:wp="http://schemas.openxmlformats.org/drawingml/2006/wordprocessingDrawing" xmlns:w10="urn:schemas-microsoft-com:office:word" xmlns:w="http://schemas.openxmlformats.org/wordprocessingml/2006/main" xmlns:w14="http://schemas.microsoft.com/office/word/2010/wordml" xmlns:w15="http://schemas.microsoft.com/office/word/2012/wordml" xmlns:w16cei="http://schemas.microsoft.com/office/word/2026/wordml/cei" xmlns:w16cex="http://schemas.microsoft.com/office/word/2018/wordml/cex" xmlns:w16cid="http://schemas.microsoft.com/office/word/2016/wordml/cid" xmlns:w16="http://schemas.microsoft.com/office/word/2018/wordml" xmlns:w16du="http://schemas.microsoft.com/office/word/2023/wordml/word16du" xmlns:w16sdtdh="http://schemas.microsoft.com/office/word/2020/wordml/sdtdatahash" xmlns:w16sdtfl="http://schemas.microsoft.com/office/word/2024/wordml/sdtformatlock" xmlns:w16se="http://schemas.microsoft.com/office/word/2015/wordml/symex" xmlns:wpg="http://schemas.microsoft.com/office/word/2010/wordprocessingGroup" xmlns:wpi="http://schemas.microsoft.com/office/word/2010/wordprocessingInk" xmlns:wne="http://schemas.microsoft.com/office/word/2006/wordml" xmlns:wps="http://schemas.microsoft.com/office/word/2010/wordprocessingShape" mc:Ignorable="w14 w15 w16se w16cid w16 w16cex w16sdtdh w16sdtfl w16du wp14">
+<w:ftr xmlns:wpc="http://schemas.microsoft.com/office/word/2010/wordprocessingCanvas" xmlns:cx="http://schemas.microsoft.com/office/drawing/2014/chartex" xmlns:cx1="http://schemas.microsoft.com/office/drawing/2015/9/8/chartex" xmlns:cx2="http://schemas.microsoft.com/office/drawing/2015/10/21/chartex" xmlns:cx3="http://schemas.microsoft.com/office/drawing/2016/5/9/chartex" xmlns:cx4="http://schemas.microsoft.com/office/drawing/2016/5/10/chartex" xmlns:cx5="http://schemas.microsoft.com/office/drawing/2016/5/11/chartex" xmlns:cx6="http://schemas.microsoft.com/office/drawing/2016/5/12/chartex" xmlns:cx7="http://schemas.microsoft.com/office/drawing/2016/5/13/chartex" xmlns:cx8="http://schemas.microsoft.com/office/drawing/2016/5/14/chartex" xmlns:mc="http://schemas.openxmlformats.org/markup-compatibility/2006" xmlns:aink="http://schemas.microsoft.com/office/drawing/2016/ink" xmlns:am3d="http://schemas.microsoft.com/office/drawing/2017/model3d" xmlns:o="urn:schemas-microsoft-com:office:office" xmlns:oel="http://schemas.microsoft.com/office/2019/extlst" xmlns:r="http://schemas.openxmlformats.org/officeDocument/2006/relationships" xmlns:m="http://schemas.openxmlformats.org/officeDocument/2006/math" xmlns:v="urn:schemas-microsoft-com:vml" xmlns:wp14="http://schemas.microsoft.com/office/word/2010/wordprocessingDrawing" xmlns:wp="http://schemas.openxmlformats.org/drawingml/2006/wordprocessingDrawing" xmlns:w10="urn:schemas-microsoft-com:office:word" xmlns:w="http://schemas.openxmlformats.org/wordprocessingml/2006/main" xmlns:w14="http://schemas.microsoft.com/office/word/2010/wordml" xmlns:w15="http://schemas.microsoft.com/office/word/2012/wordml" xmlns:w16cex="http://schemas.microsoft.com/office/word/2018/wordml/cex" xmlns:w16cid="http://schemas.microsoft.com/office/word/2016/wordml/cid" xmlns:w16="http://schemas.microsoft.com/office/word/2018/wordml" xmlns:w16du="http://schemas.microsoft.com/office/word/2023/wordml/word16du" xmlns:w16sdtdh="http://schemas.microsoft.com/office/word/2020/wordml/sdtdatahash" xmlns:w16sdtfl="http://schemas.microsoft.com/office/word/2024/wordml/sdtformatlock" xmlns:w16se="http://schemas.microsoft.com/office/word/2015/wordml/symex" xmlns:wpg="http://schemas.microsoft.com/office/word/2010/wordprocessingGroup" xmlns:wpi="http://schemas.microsoft.com/office/word/2010/wordprocessingInk" xmlns:wne="http://schemas.microsoft.com/office/word/2006/wordml" xmlns:wps="http://schemas.microsoft.com/office/word/2010/wordprocessingShape" mc:Ignorable="w14 w15 w16se w16cid w16 w16cex w16sdtdh w16sdtfl w16du wp14">
   <w:sdt>
     <w:sdtPr>
       <w:id w:val="1628128157"/>
@@ -6548,7 +6570,7 @@
 </file>
 
 <file path=word/footnotes.xml><?xml version="1.0" encoding="utf-8"?>
-<w:footnotes xmlns:wpc="http://schemas.microsoft.com/office/word/2010/wordprocessingCanvas" xmlns:cx="http://schemas.microsoft.com/office/drawing/2014/chartex" xmlns:cx1="http://schemas.microsoft.com/office/drawing/2015/9/8/chartex" xmlns:cx2="http://schemas.microsoft.com/office/drawing/2015/10/21/chartex" xmlns:cx3="http://schemas.microsoft.com/office/drawing/2016/5/9/chartex" xmlns:cx4="http://schemas.microsoft.com/office/drawing/2016/5/10/chartex" xmlns:cx5="http://schemas.microsoft.com/office/drawing/2016/5/11/chartex" xmlns:cx6="http://schemas.microsoft.com/office/drawing/2016/5/12/chartex" xmlns:cx7="http://schemas.microsoft.com/office/drawing/2016/5/13/chartex" xmlns:cx8="http://schemas.microsoft.com/office/drawing/2016/5/14/chartex" xmlns:mc="http://schemas.openxmlformats.org/markup-compatibility/2006" xmlns:aink="http://schemas.microsoft.com/office/drawing/2016/ink" xmlns:am3d="http://schemas.microsoft.com/office/drawing/2017/model3d" xmlns:o="urn:schemas-microsoft-com:office:office" xmlns:oel="http://schemas.microsoft.com/office/2019/extlst" xmlns:r="http://schemas.openxmlformats.org/officeDocument/2006/relationships" xmlns:m="http://schemas.openxmlformats.org/officeDocument/2006/math" xmlns:v="urn:schemas-microsoft-com:vml" xmlns:wp14="http://schemas.microsoft.com/office/word/2010/wordprocessingDrawing" xmlns:wp="http://schemas.openxmlformats.org/drawingml/2006/wordprocessingDrawing" xmlns:w10="urn:schemas-microsoft-com:office:word" xmlns:w="http://schemas.openxmlformats.org/wordprocessingml/2006/main" xmlns:w14="http://schemas.microsoft.com/office/word/2010/wordml" xmlns:w15="http://schemas.microsoft.com/office/word/2012/wordml" xmlns:w16cei="http://schemas.microsoft.com/office/word/2026/wordml/cei" xmlns:w16cex="http://schemas.microsoft.com/office/word/2018/wordml/cex" xmlns:w16cid="http://schemas.microsoft.com/office/word/2016/wordml/cid" xmlns:w16="http://schemas.microsoft.com/office/word/2018/wordml" xmlns:w16du="http://schemas.microsoft.com/office/word/2023/wordml/word16du" xmlns:w16sdtdh="http://schemas.microsoft.com/office/word/2020/wordml/sdtdatahash" xmlns:w16sdtfl="http://schemas.microsoft.com/office/word/2024/wordml/sdtformatlock" xmlns:w16se="http://schemas.microsoft.com/office/word/2015/wordml/symex" xmlns:wpg="http://schemas.microsoft.com/office/word/2010/wordprocessingGroup" xmlns:wpi="http://schemas.microsoft.com/office/word/2010/wordprocessingInk" xmlns:wne="http://schemas.microsoft.com/office/word/2006/wordml" xmlns:wps="http://schemas.microsoft.com/office/word/2010/wordprocessingShape" mc:Ignorable="w14 w15 w16se w16cid w16 w16cex w16sdtdh w16sdtfl w16du wp14">
+<w:footnotes xmlns:wpc="http://schemas.microsoft.com/office/word/2010/wordprocessingCanvas" xmlns:cx="http://schemas.microsoft.com/office/drawing/2014/chartex" xmlns:cx1="http://schemas.microsoft.com/office/drawing/2015/9/8/chartex" xmlns:cx2="http://schemas.microsoft.com/office/drawing/2015/10/21/chartex" xmlns:cx3="http://schemas.microsoft.com/office/drawing/2016/5/9/chartex" xmlns:cx4="http://schemas.microsoft.com/office/drawing/2016/5/10/chartex" xmlns:cx5="http://schemas.microsoft.com/office/drawing/2016/5/11/chartex" xmlns:cx6="http://schemas.microsoft.com/office/drawing/2016/5/12/chartex" xmlns:cx7="http://schemas.microsoft.com/office/drawing/2016/5/13/chartex" xmlns:cx8="http://schemas.microsoft.com/office/drawing/2016/5/14/chartex" xmlns:mc="http://schemas.openxmlformats.org/markup-compatibility/2006" xmlns:aink="http://schemas.microsoft.com/office/drawing/2016/ink" xmlns:am3d="http://schemas.microsoft.com/office/drawing/2017/model3d" xmlns:o="urn:schemas-microsoft-com:office:office" xmlns:oel="http://schemas.microsoft.com/office/2019/extlst" xmlns:r="http://schemas.openxmlformats.org/officeDocument/2006/relationships" xmlns:m="http://schemas.openxmlformats.org/officeDocument/2006/math" xmlns:v="urn:schemas-microsoft-com:vml" xmlns:wp14="http://schemas.microsoft.com/office/word/2010/wordprocessingDrawing" xmlns:wp="http://schemas.openxmlformats.org/drawingml/2006/wordprocessingDrawing" xmlns:w10="urn:schemas-microsoft-com:office:word" xmlns:w="http://schemas.openxmlformats.org/wordprocessingml/2006/main" xmlns:w14="http://schemas.microsoft.com/office/word/2010/wordml" xmlns:w15="http://schemas.microsoft.com/office/word/2012/wordml" xmlns:w16cex="http://schemas.microsoft.com/office/word/2018/wordml/cex" xmlns:w16cid="http://schemas.microsoft.com/office/word/2016/wordml/cid" xmlns:w16="http://schemas.microsoft.com/office/word/2018/wordml" xmlns:w16du="http://schemas.microsoft.com/office/word/2023/wordml/word16du" xmlns:w16sdtdh="http://schemas.microsoft.com/office/word/2020/wordml/sdtdatahash" xmlns:w16sdtfl="http://schemas.microsoft.com/office/word/2024/wordml/sdtformatlock" xmlns:w16se="http://schemas.microsoft.com/office/word/2015/wordml/symex" xmlns:wpg="http://schemas.microsoft.com/office/word/2010/wordprocessingGroup" xmlns:wpi="http://schemas.microsoft.com/office/word/2010/wordprocessingInk" xmlns:wne="http://schemas.microsoft.com/office/word/2006/wordml" xmlns:wps="http://schemas.microsoft.com/office/word/2010/wordprocessingShape" mc:Ignorable="w14 w15 w16se w16cid w16 w16cex w16sdtdh w16sdtfl w16du wp14">
   <w:footnote w:type="separator" w:id="-1">
     <w:p>
       <w:pPr>
@@ -6573,7 +6595,7 @@
 </file>
 
 <file path=word/header1.xml><?xml version="1.0" encoding="utf-8"?>
-<w:hdr xmlns:wpc="http://schemas.microsoft.com/office/word/2010/wordprocessingCanvas" xmlns:cx="http://schemas.microsoft.com/office/drawing/2014/chartex" xmlns:cx1="http://schemas.microsoft.com/office/drawing/2015/9/8/chartex" xmlns:cx2="http://schemas.microsoft.com/office/drawing/2015/10/21/chartex" xmlns:cx3="http://schemas.microsoft.com/office/drawing/2016/5/9/chartex" xmlns:cx4="http://schemas.microsoft.com/office/drawing/2016/5/10/chartex" xmlns:cx5="http://schemas.microsoft.com/office/drawing/2016/5/11/chartex" xmlns:cx6="http://schemas.microsoft.com/office/drawing/2016/5/12/chartex" xmlns:cx7="http://schemas.microsoft.com/office/drawing/2016/5/13/chartex" xmlns:cx8="http://schemas.microsoft.com/office/drawing/2016/5/14/chartex" xmlns:mc="http://schemas.openxmlformats.org/markup-compatibility/2006" xmlns:aink="http://schemas.microsoft.com/office/drawing/2016/ink" xmlns:am3d="http://schemas.microsoft.com/office/drawing/2017/model3d" xmlns:o="urn:schemas-microsoft-com:office:office" xmlns:oel="http://schemas.microsoft.com/office/2019/extlst" xmlns:r="http://schemas.openxmlformats.org/officeDocument/2006/relationships" xmlns:m="http://schemas.openxmlformats.org/officeDocument/2006/math" xmlns:v="urn:schemas-microsoft-com:vml" xmlns:wp14="http://schemas.microsoft.com/office/word/2010/wordprocessingDrawing" xmlns:wp="http://schemas.openxmlformats.org/drawingml/2006/wordprocessingDrawing" xmlns:w10="urn:schemas-microsoft-com:office:word" xmlns:w="http://schemas.openxmlformats.org/wordprocessingml/2006/main" xmlns:w14="http://schemas.microsoft.com/office/word/2010/wordml" xmlns:w15="http://schemas.microsoft.com/office/word/2012/wordml" xmlns:w16cei="http://schemas.microsoft.com/office/word/2026/wordml/cei" xmlns:w16cex="http://schemas.microsoft.com/office/word/2018/wordml/cex" xmlns:w16cid="http://schemas.microsoft.com/office/word/2016/wordml/cid" xmlns:w16="http://schemas.microsoft.com/office/word/2018/wordml" xmlns:w16du="http://schemas.microsoft.com/office/word/2023/wordml/word16du" xmlns:w16sdtdh="http://schemas.microsoft.com/office/word/2020/wordml/sdtdatahash" xmlns:w16sdtfl="http://schemas.microsoft.com/office/word/2024/wordml/sdtformatlock" xmlns:w16se="http://schemas.microsoft.com/office/word/2015/wordml/symex" xmlns:wpg="http://schemas.microsoft.com/office/word/2010/wordprocessingGroup" xmlns:wpi="http://schemas.microsoft.com/office/word/2010/wordprocessingInk" xmlns:wne="http://schemas.microsoft.com/office/word/2006/wordml" xmlns:wps="http://schemas.microsoft.com/office/word/2010/wordprocessingShape" mc:Ignorable="w14 w15 w16se w16cid w16 w16cex w16sdtdh w16sdtfl w16du wp14">
+<w:hdr xmlns:wpc="http://schemas.microsoft.com/office/word/2010/wordprocessingCanvas" xmlns:cx="http://schemas.microsoft.com/office/drawing/2014/chartex" xmlns:cx1="http://schemas.microsoft.com/office/drawing/2015/9/8/chartex" xmlns:cx2="http://schemas.microsoft.com/office/drawing/2015/10/21/chartex" xmlns:cx3="http://schemas.microsoft.com/office/drawing/2016/5/9/chartex" xmlns:cx4="http://schemas.microsoft.com/office/drawing/2016/5/10/chartex" xmlns:cx5="http://schemas.microsoft.com/office/drawing/2016/5/11/chartex" xmlns:cx6="http://schemas.microsoft.com/office/drawing/2016/5/12/chartex" xmlns:cx7="http://schemas.microsoft.com/office/drawing/2016/5/13/chartex" xmlns:cx8="http://schemas.microsoft.com/office/drawing/2016/5/14/chartex" xmlns:mc="http://schemas.openxmlformats.org/markup-compatibility/2006" xmlns:aink="http://schemas.microsoft.com/office/drawing/2016/ink" xmlns:am3d="http://schemas.microsoft.com/office/drawing/2017/model3d" xmlns:o="urn:schemas-microsoft-com:office:office" xmlns:oel="http://schemas.microsoft.com/office/2019/extlst" xmlns:r="http://schemas.openxmlformats.org/officeDocument/2006/relationships" xmlns:m="http://schemas.openxmlformats.org/officeDocument/2006/math" xmlns:v="urn:schemas-microsoft-com:vml" xmlns:wp14="http://schemas.microsoft.com/office/word/2010/wordprocessingDrawing" xmlns:wp="http://schemas.openxmlformats.org/drawingml/2006/wordprocessingDrawing" xmlns:w10="urn:schemas-microsoft-com:office:word" xmlns:w="http://schemas.openxmlformats.org/wordprocessingml/2006/main" xmlns:w14="http://schemas.microsoft.com/office/word/2010/wordml" xmlns:w15="http://schemas.microsoft.com/office/word/2012/wordml" xmlns:w16cex="http://schemas.microsoft.com/office/word/2018/wordml/cex" xmlns:w16cid="http://schemas.microsoft.com/office/word/2016/wordml/cid" xmlns:w16="http://schemas.microsoft.com/office/word/2018/wordml" xmlns:w16du="http://schemas.microsoft.com/office/word/2023/wordml/word16du" xmlns:w16sdtdh="http://schemas.microsoft.com/office/word/2020/wordml/sdtdatahash" xmlns:w16sdtfl="http://schemas.microsoft.com/office/word/2024/wordml/sdtformatlock" xmlns:w16se="http://schemas.microsoft.com/office/word/2015/wordml/symex" xmlns:wpg="http://schemas.microsoft.com/office/word/2010/wordprocessingGroup" xmlns:wpi="http://schemas.microsoft.com/office/word/2010/wordprocessingInk" xmlns:wne="http://schemas.microsoft.com/office/word/2006/wordml" xmlns:wps="http://schemas.microsoft.com/office/word/2010/wordprocessingShape" mc:Ignorable="w14 w15 w16se w16cid w16 w16cex w16sdtdh w16sdtfl w16du wp14">
   <w:p>
     <w:pPr>
       <w:pStyle w:val="Intestazione"/>
@@ -6583,7 +6605,7 @@
 </file>
 
 <file path=word/header2.xml><?xml version="1.0" encoding="utf-8"?>
-<w:hdr xmlns:wpc="http://schemas.microsoft.com/office/word/2010/wordprocessingCanvas" xmlns:cx="http://schemas.microsoft.com/office/drawing/2014/chartex" xmlns:cx1="http://schemas.microsoft.com/office/drawing/2015/9/8/chartex" xmlns:cx2="http://schemas.microsoft.com/office/drawing/2015/10/21/chartex" xmlns:cx3="http://schemas.microsoft.com/office/drawing/2016/5/9/chartex" xmlns:cx4="http://schemas.microsoft.com/office/drawing/2016/5/10/chartex" xmlns:cx5="http://schemas.microsoft.com/office/drawing/2016/5/11/chartex" xmlns:cx6="http://schemas.microsoft.com/office/drawing/2016/5/12/chartex" xmlns:cx7="http://schemas.microsoft.com/office/drawing/2016/5/13/chartex" xmlns:cx8="http://schemas.microsoft.com/office/drawing/2016/5/14/chartex" xmlns:mc="http://schemas.openxmlformats.org/markup-compatibility/2006" xmlns:aink="http://schemas.microsoft.com/office/drawing/2016/ink" xmlns:am3d="http://schemas.microsoft.com/office/drawing/2017/model3d" xmlns:o="urn:schemas-microsoft-com:office:office" xmlns:oel="http://schemas.microsoft.com/office/2019/extlst" xmlns:r="http://schemas.openxmlformats.org/officeDocument/2006/relationships" xmlns:m="http://schemas.openxmlformats.org/officeDocument/2006/math" xmlns:v="urn:schemas-microsoft-com:vml" xmlns:wp14="http://schemas.microsoft.com/office/word/2010/wordprocessingDrawing" xmlns:wp="http://schemas.openxmlformats.org/drawingml/2006/wordprocessingDrawing" xmlns:w10="urn:schemas-microsoft-com:office:word" xmlns:w="http://schemas.openxmlformats.org/wordprocessingml/2006/main" xmlns:w14="http://schemas.microsoft.com/office/word/2010/wordml" xmlns:w15="http://schemas.microsoft.com/office/word/2012/wordml" xmlns:w16cei="http://schemas.microsoft.com/office/word/2026/wordml/cei" xmlns:w16cex="http://schemas.microsoft.com/office/word/2018/wordml/cex" xmlns:w16cid="http://schemas.microsoft.com/office/word/2016/wordml/cid" xmlns:w16="http://schemas.microsoft.com/office/word/2018/wordml" xmlns:w16du="http://schemas.microsoft.com/office/word/2023/wordml/word16du" xmlns:w16sdtdh="http://schemas.microsoft.com/office/word/2020/wordml/sdtdatahash" xmlns:w16sdtfl="http://schemas.microsoft.com/office/word/2024/wordml/sdtformatlock" xmlns:w16se="http://schemas.microsoft.com/office/word/2015/wordml/symex" xmlns:wpg="http://schemas.microsoft.com/office/word/2010/wordprocessingGroup" xmlns:wpi="http://schemas.microsoft.com/office/word/2010/wordprocessingInk" xmlns:wne="http://schemas.microsoft.com/office/word/2006/wordml" xmlns:wps="http://schemas.microsoft.com/office/word/2010/wordprocessingShape" mc:Ignorable="w14 w15 w16se w16cid w16 w16cex w16sdtdh w16sdtfl w16du wp14">
+<w:hdr xmlns:wpc="http://schemas.microsoft.com/office/word/2010/wordprocessingCanvas" xmlns:cx="http://schemas.microsoft.com/office/drawing/2014/chartex" xmlns:cx1="http://schemas.microsoft.com/office/drawing/2015/9/8/chartex" xmlns:cx2="http://schemas.microsoft.com/office/drawing/2015/10/21/chartex" xmlns:cx3="http://schemas.microsoft.com/office/drawing/2016/5/9/chartex" xmlns:cx4="http://schemas.microsoft.com/office/drawing/2016/5/10/chartex" xmlns:cx5="http://schemas.microsoft.com/office/drawing/2016/5/11/chartex" xmlns:cx6="http://schemas.microsoft.com/office/drawing/2016/5/12/chartex" xmlns:cx7="http://schemas.microsoft.com/office/drawing/2016/5/13/chartex" xmlns:cx8="http://schemas.microsoft.com/office/drawing/2016/5/14/chartex" xmlns:mc="http://schemas.openxmlformats.org/markup-compatibility/2006" xmlns:aink="http://schemas.microsoft.com/office/drawing/2016/ink" xmlns:am3d="http://schemas.microsoft.com/office/drawing/2017/model3d" xmlns:o="urn:schemas-microsoft-com:office:office" xmlns:oel="http://schemas.microsoft.com/office/2019/extlst" xmlns:r="http://schemas.openxmlformats.org/officeDocument/2006/relationships" xmlns:m="http://schemas.openxmlformats.org/officeDocument/2006/math" xmlns:v="urn:schemas-microsoft-com:vml" xmlns:wp14="http://schemas.microsoft.com/office/word/2010/wordprocessingDrawing" xmlns:wp="http://schemas.openxmlformats.org/drawingml/2006/wordprocessingDrawing" xmlns:w10="urn:schemas-microsoft-com:office:word" xmlns:w="http://schemas.openxmlformats.org/wordprocessingml/2006/main" xmlns:w14="http://schemas.microsoft.com/office/word/2010/wordml" xmlns:w15="http://schemas.microsoft.com/office/word/2012/wordml" xmlns:w16cex="http://schemas.microsoft.com/office/word/2018/wordml/cex" xmlns:w16cid="http://schemas.microsoft.com/office/word/2016/wordml/cid" xmlns:w16="http://schemas.microsoft.com/office/word/2018/wordml" xmlns:w16du="http://schemas.microsoft.com/office/word/2023/wordml/word16du" xmlns:w16sdtdh="http://schemas.microsoft.com/office/word/2020/wordml/sdtdatahash" xmlns:w16sdtfl="http://schemas.microsoft.com/office/word/2024/wordml/sdtformatlock" xmlns:w16se="http://schemas.microsoft.com/office/word/2015/wordml/symex" xmlns:wpg="http://schemas.microsoft.com/office/word/2010/wordprocessingGroup" xmlns:wpi="http://schemas.microsoft.com/office/word/2010/wordprocessingInk" xmlns:wne="http://schemas.microsoft.com/office/word/2006/wordml" xmlns:wps="http://schemas.microsoft.com/office/word/2010/wordprocessingShape" mc:Ignorable="w14 w15 w16se w16cid w16 w16cex w16sdtdh w16sdtfl w16du wp14">
   <w:p>
     <w:pPr>
       <w:pStyle w:val="Intestazione"/>
@@ -6593,7 +6615,7 @@
 </file>
 
 <file path=word/header3.xml><?xml version="1.0" encoding="utf-8"?>
-<w:hdr xmlns:wpc="http://schemas.microsoft.com/office/word/2010/wordprocessingCanvas" xmlns:cx="http://schemas.microsoft.com/office/drawing/2014/chartex" xmlns:cx1="http://schemas.microsoft.com/office/drawing/2015/9/8/chartex" xmlns:cx2="http://schemas.microsoft.com/office/drawing/2015/10/21/chartex" xmlns:cx3="http://schemas.microsoft.com/office/drawing/2016/5/9/chartex" xmlns:cx4="http://schemas.microsoft.com/office/drawing/2016/5/10/chartex" xmlns:cx5="http://schemas.microsoft.com/office/drawing/2016/5/11/chartex" xmlns:cx6="http://schemas.microsoft.com/office/drawing/2016/5/12/chartex" xmlns:cx7="http://schemas.microsoft.com/office/drawing/2016/5/13/chartex" xmlns:cx8="http://schemas.microsoft.com/office/drawing/2016/5/14/chartex" xmlns:mc="http://schemas.openxmlformats.org/markup-compatibility/2006" xmlns:aink="http://schemas.microsoft.com/office/drawing/2016/ink" xmlns:am3d="http://schemas.microsoft.com/office/drawing/2017/model3d" xmlns:o="urn:schemas-microsoft-com:office:office" xmlns:oel="http://schemas.microsoft.com/office/2019/extlst" xmlns:r="http://schemas.openxmlformats.org/officeDocument/2006/relationships" xmlns:m="http://schemas.openxmlformats.org/officeDocument/2006/math" xmlns:v="urn:schemas-microsoft-com:vml" xmlns:wp14="http://schemas.microsoft.com/office/word/2010/wordprocessingDrawing" xmlns:wp="http://schemas.openxmlformats.org/drawingml/2006/wordprocessingDrawing" xmlns:w10="urn:schemas-microsoft-com:office:word" xmlns:w="http://schemas.openxmlformats.org/wordprocessingml/2006/main" xmlns:w14="http://schemas.microsoft.com/office/word/2010/wordml" xmlns:w15="http://schemas.microsoft.com/office/word/2012/wordml" xmlns:w16cei="http://schemas.microsoft.com/office/word/2026/wordml/cei" xmlns:w16cex="http://schemas.microsoft.com/office/word/2018/wordml/cex" xmlns:w16cid="http://schemas.microsoft.com/office/word/2016/wordml/cid" xmlns:w16="http://schemas.microsoft.com/office/word/2018/wordml" xmlns:w16du="http://schemas.microsoft.com/office/word/2023/wordml/word16du" xmlns:w16sdtdh="http://schemas.microsoft.com/office/word/2020/wordml/sdtdatahash" xmlns:w16sdtfl="http://schemas.microsoft.com/office/word/2024/wordml/sdtformatlock" xmlns:w16se="http://schemas.microsoft.com/office/word/2015/wordml/symex" xmlns:wpg="http://schemas.microsoft.com/office/word/2010/wordprocessingGroup" xmlns:wpi="http://schemas.microsoft.com/office/word/2010/wordprocessingInk" xmlns:wne="http://schemas.microsoft.com/office/word/2006/wordml" xmlns:wps="http://schemas.microsoft.com/office/word/2010/wordprocessingShape" mc:Ignorable="w14 w15 w16se w16cid w16 w16cex w16sdtdh w16sdtfl w16du wp14">
+<w:hdr xmlns:wpc="http://schemas.microsoft.com/office/word/2010/wordprocessingCanvas" xmlns:cx="http://schemas.microsoft.com/office/drawing/2014/chartex" xmlns:cx1="http://schemas.microsoft.com/office/drawing/2015/9/8/chartex" xmlns:cx2="http://schemas.microsoft.com/office/drawing/2015/10/21/chartex" xmlns:cx3="http://schemas.microsoft.com/office/drawing/2016/5/9/chartex" xmlns:cx4="http://schemas.microsoft.com/office/drawing/2016/5/10/chartex" xmlns:cx5="http://schemas.microsoft.com/office/drawing/2016/5/11/chartex" xmlns:cx6="http://schemas.microsoft.com/office/drawing/2016/5/12/chartex" xmlns:cx7="http://schemas.microsoft.com/office/drawing/2016/5/13/chartex" xmlns:cx8="http://schemas.microsoft.com/office/drawing/2016/5/14/chartex" xmlns:mc="http://schemas.openxmlformats.org/markup-compatibility/2006" xmlns:aink="http://schemas.microsoft.com/office/drawing/2016/ink" xmlns:am3d="http://schemas.microsoft.com/office/drawing/2017/model3d" xmlns:o="urn:schemas-microsoft-com:office:office" xmlns:oel="http://schemas.microsoft.com/office/2019/extlst" xmlns:r="http://schemas.openxmlformats.org/officeDocument/2006/relationships" xmlns:m="http://schemas.openxmlformats.org/officeDocument/2006/math" xmlns:v="urn:schemas-microsoft-com:vml" xmlns:wp14="http://schemas.microsoft.com/office/word/2010/wordprocessingDrawing" xmlns:wp="http://schemas.openxmlformats.org/drawingml/2006/wordprocessingDrawing" xmlns:w10="urn:schemas-microsoft-com:office:word" xmlns:w="http://schemas.openxmlformats.org/wordprocessingml/2006/main" xmlns:w14="http://schemas.microsoft.com/office/word/2010/wordml" xmlns:w15="http://schemas.microsoft.com/office/word/2012/wordml" xmlns:w16cex="http://schemas.microsoft.com/office/word/2018/wordml/cex" xmlns:w16cid="http://schemas.microsoft.com/office/word/2016/wordml/cid" xmlns:w16="http://schemas.microsoft.com/office/word/2018/wordml" xmlns:w16du="http://schemas.microsoft.com/office/word/2023/wordml/word16du" xmlns:w16sdtdh="http://schemas.microsoft.com/office/word/2020/wordml/sdtdatahash" xmlns:w16sdtfl="http://schemas.microsoft.com/office/word/2024/wordml/sdtformatlock" xmlns:w16se="http://schemas.microsoft.com/office/word/2015/wordml/symex" xmlns:wpg="http://schemas.microsoft.com/office/word/2010/wordprocessingGroup" xmlns:wpi="http://schemas.microsoft.com/office/word/2010/wordprocessingInk" xmlns:wne="http://schemas.microsoft.com/office/word/2006/wordml" xmlns:wps="http://schemas.microsoft.com/office/word/2010/wordprocessingShape" mc:Ignorable="w14 w15 w16se w16cid w16 w16cex w16sdtdh w16sdtfl w16du wp14">
   <w:p>
     <w:pPr>
       <w:pStyle w:val="Intestazione"/>
@@ -6603,7 +6625,7 @@
 </file>
 
 <file path=word/numbering.xml><?xml version="1.0" encoding="utf-8"?>
-<w:numbering xmlns:wpc="http://schemas.microsoft.com/office/word/2010/wordprocessingCanvas" xmlns:cx="http://schemas.microsoft.com/office/drawing/2014/chartex" xmlns:cx1="http://schemas.microsoft.com/office/drawing/2015/9/8/chartex" xmlns:cx2="http://schemas.microsoft.com/office/drawing/2015/10/21/chartex" xmlns:cx3="http://schemas.microsoft.com/office/drawing/2016/5/9/chartex" xmlns:cx4="http://schemas.microsoft.com/office/drawing/2016/5/10/chartex" xmlns:cx5="http://schemas.microsoft.com/office/drawing/2016/5/11/chartex" xmlns:cx6="http://schemas.microsoft.com/office/drawing/2016/5/12/chartex" xmlns:cx7="http://schemas.microsoft.com/office/drawing/2016/5/13/chartex" xmlns:cx8="http://schemas.microsoft.com/office/drawing/2016/5/14/chartex" xmlns:mc="http://schemas.openxmlformats.org/markup-compatibility/2006" xmlns:aink="http://schemas.microsoft.com/office/drawing/2016/ink" xmlns:am3d="http://schemas.microsoft.com/office/drawing/2017/model3d" xmlns:o="urn:schemas-microsoft-com:office:office" xmlns:oel="http://schemas.microsoft.com/office/2019/extlst" xmlns:r="http://schemas.openxmlformats.org/officeDocument/2006/relationships" xmlns:m="http://schemas.openxmlformats.org/officeDocument/2006/math" xmlns:v="urn:schemas-microsoft-com:vml" xmlns:wp14="http://schemas.microsoft.com/office/word/2010/wordprocessingDrawing" xmlns:wp="http://schemas.openxmlformats.org/drawingml/2006/wordprocessingDrawing" xmlns:w10="urn:schemas-microsoft-com:office:word" xmlns:w="http://schemas.openxmlformats.org/wordprocessingml/2006/main" xmlns:w14="http://schemas.microsoft.com/office/word/2010/wordml" xmlns:w15="http://schemas.microsoft.com/office/word/2012/wordml" xmlns:w16cei="http://schemas.microsoft.com/office/word/2026/wordml/cei" xmlns:w16cex="http://schemas.microsoft.com/office/word/2018/wordml/cex" xmlns:w16cid="http://schemas.microsoft.com/office/word/2016/wordml/cid" xmlns:w16="http://schemas.microsoft.com/office/word/2018/wordml" xmlns:w16du="http://schemas.microsoft.com/office/word/2023/wordml/word16du" xmlns:w16sdtdh="http://schemas.microsoft.com/office/word/2020/wordml/sdtdatahash" xmlns:w16sdtfl="http://schemas.microsoft.com/office/word/2024/wordml/sdtformatlock" xmlns:w16se="http://schemas.microsoft.com/office/word/2015/wordml/symex" xmlns:wpg="http://schemas.microsoft.com/office/word/2010/wordprocessingGroup" xmlns:wpi="http://schemas.microsoft.com/office/word/2010/wordprocessingInk" xmlns:wne="http://schemas.microsoft.com/office/word/2006/wordml" xmlns:wps="http://schemas.microsoft.com/office/word/2010/wordprocessingShape" mc:Ignorable="w14 w15 w16se w16cid w16 w16cex w16sdtdh w16sdtfl w16du wp14">
+<w:numbering xmlns:wpc="http://schemas.microsoft.com/office/word/2010/wordprocessingCanvas" xmlns:cx="http://schemas.microsoft.com/office/drawing/2014/chartex" xmlns:cx1="http://schemas.microsoft.com/office/drawing/2015/9/8/chartex" xmlns:cx2="http://schemas.microsoft.com/office/drawing/2015/10/21/chartex" xmlns:cx3="http://schemas.microsoft.com/office/drawing/2016/5/9/chartex" xmlns:cx4="http://schemas.microsoft.com/office/drawing/2016/5/10/chartex" xmlns:cx5="http://schemas.microsoft.com/office/drawing/2016/5/11/chartex" xmlns:cx6="http://schemas.microsoft.com/office/drawing/2016/5/12/chartex" xmlns:cx7="http://schemas.microsoft.com/office/drawing/2016/5/13/chartex" xmlns:cx8="http://schemas.microsoft.com/office/drawing/2016/5/14/chartex" xmlns:mc="http://schemas.openxmlformats.org/markup-compatibility/2006" xmlns:aink="http://schemas.microsoft.com/office/drawing/2016/ink" xmlns:am3d="http://schemas.microsoft.com/office/drawing/2017/model3d" xmlns:o="urn:schemas-microsoft-com:office:office" xmlns:oel="http://schemas.microsoft.com/office/2019/extlst" xmlns:r="http://schemas.openxmlformats.org/officeDocument/2006/relationships" xmlns:m="http://schemas.openxmlformats.org/officeDocument/2006/math" xmlns:v="urn:schemas-microsoft-com:vml" xmlns:wp14="http://schemas.microsoft.com/office/word/2010/wordprocessingDrawing" xmlns:wp="http://schemas.openxmlformats.org/drawingml/2006/wordprocessingDrawing" xmlns:w10="urn:schemas-microsoft-com:office:word" xmlns:w="http://schemas.openxmlformats.org/wordprocessingml/2006/main" xmlns:w14="http://schemas.microsoft.com/office/word/2010/wordml" xmlns:w15="http://schemas.microsoft.com/office/word/2012/wordml" xmlns:w16cex="http://schemas.microsoft.com/office/word/2018/wordml/cex" xmlns:w16cid="http://schemas.microsoft.com/office/word/2016/wordml/cid" xmlns:w16="http://schemas.microsoft.com/office/word/2018/wordml" xmlns:w16du="http://schemas.microsoft.com/office/word/2023/wordml/word16du" xmlns:w16sdtdh="http://schemas.microsoft.com/office/word/2020/wordml/sdtdatahash" xmlns:w16sdtfl="http://schemas.microsoft.com/office/word/2024/wordml/sdtformatlock" xmlns:w16se="http://schemas.microsoft.com/office/word/2015/wordml/symex" xmlns:wpg="http://schemas.microsoft.com/office/word/2010/wordprocessingGroup" xmlns:wpi="http://schemas.microsoft.com/office/word/2010/wordprocessingInk" xmlns:wne="http://schemas.microsoft.com/office/word/2006/wordml" xmlns:wps="http://schemas.microsoft.com/office/word/2010/wordprocessingShape" mc:Ignorable="w14 w15 w16se w16cid w16 w16cex w16sdtdh w16sdtfl w16du wp14">
   <w:abstractNum w:abstractNumId="0" w15:restartNumberingAfterBreak="0">
     <w:nsid w:val="03E05402"/>
     <w:multiLevelType w:val="hybridMultilevel"/>

</xml_diff>